<commit_message>
Algoritmo de coloreo correcto.
</commit_message>
<xml_diff>
--- a/p4/P4.docx
+++ b/p4/P4.docx
@@ -1,6 +1,6 @@
 
 <file path=word/document.xml><?xml version="1.0" encoding="utf-8"?>
-<w:document xmlns:wpc="http://schemas.microsoft.com/office/word/2010/wordprocessingCanvas" xmlns:cx="http://schemas.microsoft.com/office/drawing/2014/chartex" xmlns:cx1="http://schemas.microsoft.com/office/drawing/2015/9/8/chartex" xmlns:mc="http://schemas.openxmlformats.org/markup-compatibility/2006" xmlns:o="urn:schemas-microsoft-com:office:office" xmlns:r="http://schemas.openxmlformats.org/officeDocument/2006/relationships" xmlns:m="http://schemas.openxmlformats.org/officeDocument/2006/math" xmlns:v="urn:schemas-microsoft-com:vml" xmlns:wp14="http://schemas.microsoft.com/office/word/2010/wordprocessingDrawing" xmlns:wp="http://schemas.openxmlformats.org/drawingml/2006/wordprocessingDrawing" xmlns:w10="urn:schemas-microsoft-com:office:word" xmlns:w="http://schemas.openxmlformats.org/wordprocessingml/2006/main" xmlns:w14="http://schemas.microsoft.com/office/word/2010/wordml" xmlns:w15="http://schemas.microsoft.com/office/word/2012/wordml" xmlns:w16se="http://schemas.microsoft.com/office/word/2015/wordml/symex" xmlns:wpg="http://schemas.microsoft.com/office/word/2010/wordprocessingGroup" xmlns:wpi="http://schemas.microsoft.com/office/word/2010/wordprocessingInk" xmlns:wne="http://schemas.microsoft.com/office/word/2006/wordml" xmlns:wps="http://schemas.microsoft.com/office/word/2010/wordprocessingShape" mc:Ignorable="w14 w15 w16se wp14">
+<w:document xmlns:wpc="http://schemas.microsoft.com/office/word/2010/wordprocessingCanvas" xmlns:cx="http://schemas.microsoft.com/office/drawing/2014/chartex" xmlns:mc="http://schemas.openxmlformats.org/markup-compatibility/2006" xmlns:o="urn:schemas-microsoft-com:office:office" xmlns:r="http://schemas.openxmlformats.org/officeDocument/2006/relationships" xmlns:m="http://schemas.openxmlformats.org/officeDocument/2006/math" xmlns:v="urn:schemas-microsoft-com:vml" xmlns:wp14="http://schemas.microsoft.com/office/word/2010/wordprocessingDrawing" xmlns:wp="http://schemas.openxmlformats.org/drawingml/2006/wordprocessingDrawing" xmlns:w10="urn:schemas-microsoft-com:office:word" xmlns:w="http://schemas.openxmlformats.org/wordprocessingml/2006/main" xmlns:w14="http://schemas.microsoft.com/office/word/2010/wordml" xmlns:w15="http://schemas.microsoft.com/office/word/2012/wordml" xmlns:w16se="http://schemas.microsoft.com/office/word/2015/wordml/symex" xmlns:wpg="http://schemas.microsoft.com/office/word/2010/wordprocessingGroup" xmlns:wpi="http://schemas.microsoft.com/office/word/2010/wordprocessingInk" xmlns:wne="http://schemas.microsoft.com/office/word/2006/wordml" xmlns:wps="http://schemas.microsoft.com/office/word/2010/wordprocessingShape" mc:Ignorable="w14 w15 w16se wp14">
   <w:body>
     <w:p>
       <w:pPr>
@@ -14158,7 +14158,6 @@
           <w:lang w:val="en-GB" w:eastAsia="es-ES"/>
         </w:rPr>
       </w:pPr>
-      <w:proofErr w:type="gramStart"/>
       <w:r>
         <w:rPr>
           <w:b/>
@@ -14167,7 +14166,6 @@
         </w:rPr>
         <w:t>public</w:t>
       </w:r>
-      <w:proofErr w:type="gramEnd"/>
       <w:r>
         <w:rPr>
           <w:b/>
@@ -14451,7 +14449,6 @@
           <w:lang w:val="en-GB" w:eastAsia="es-ES"/>
         </w:rPr>
       </w:pPr>
-      <w:proofErr w:type="gramStart"/>
       <w:r>
         <w:rPr>
           <w:b/>
@@ -14462,13 +14459,160 @@
         <w:lastRenderedPageBreak/>
         <w:t>for</w:t>
       </w:r>
+      <w:r>
+        <w:rPr>
+          <w:b/>
+          <w:sz w:val="24"/>
+          <w:lang w:val="en-GB" w:eastAsia="es-ES"/>
+        </w:rPr>
+        <w:t xml:space="preserve"> (</w:t>
+      </w:r>
+      <w:proofErr w:type="spellStart"/>
+      <w:r>
+        <w:rPr>
+          <w:b/>
+          <w:color w:val="4EC9B0"/>
+          <w:sz w:val="24"/>
+          <w:lang w:val="en-GB" w:eastAsia="es-ES"/>
+        </w:rPr>
+        <w:t>int</w:t>
+      </w:r>
+      <w:proofErr w:type="spellEnd"/>
+      <w:r>
+        <w:rPr>
+          <w:b/>
+          <w:sz w:val="24"/>
+          <w:lang w:val="en-GB" w:eastAsia="es-ES"/>
+        </w:rPr>
+        <w:t xml:space="preserve"> </w:t>
+      </w:r>
+      <w:proofErr w:type="spellStart"/>
+      <w:r>
+        <w:rPr>
+          <w:b/>
+          <w:color w:val="9CDCFE"/>
+          <w:sz w:val="24"/>
+          <w:lang w:val="en-GB" w:eastAsia="es-ES"/>
+        </w:rPr>
+        <w:t>i</w:t>
+      </w:r>
+      <w:proofErr w:type="spellEnd"/>
+      <w:r>
+        <w:rPr>
+          <w:b/>
+          <w:color w:val="D4D4D4"/>
+          <w:sz w:val="24"/>
+          <w:lang w:val="en-GB" w:eastAsia="es-ES"/>
+        </w:rPr>
+        <w:t>=</w:t>
+      </w:r>
+      <w:proofErr w:type="gramStart"/>
+      <w:r>
+        <w:rPr>
+          <w:b/>
+          <w:color w:val="B5CEA8"/>
+          <w:sz w:val="24"/>
+          <w:lang w:val="en-GB" w:eastAsia="es-ES"/>
+        </w:rPr>
+        <w:t>0</w:t>
+      </w:r>
+      <w:r>
+        <w:rPr>
+          <w:b/>
+          <w:sz w:val="24"/>
+          <w:lang w:val="en-GB" w:eastAsia="es-ES"/>
+        </w:rPr>
+        <w:t>;</w:t>
+      </w:r>
+      <w:r>
+        <w:rPr>
+          <w:b/>
+          <w:color w:val="9CDCFE"/>
+          <w:sz w:val="24"/>
+          <w:lang w:val="en-GB" w:eastAsia="es-ES"/>
+        </w:rPr>
+        <w:t>i</w:t>
+      </w:r>
       <w:proofErr w:type="gramEnd"/>
       <w:r>
         <w:rPr>
           <w:b/>
+          <w:color w:val="D4D4D4"/>
           <w:sz w:val="24"/>
           <w:lang w:val="en-GB" w:eastAsia="es-ES"/>
         </w:rPr>
+        <w:t>&lt;</w:t>
+      </w:r>
+      <w:proofErr w:type="spellStart"/>
+      <w:r>
+        <w:rPr>
+          <w:b/>
+          <w:color w:val="9CDCFE"/>
+          <w:sz w:val="24"/>
+          <w:lang w:val="en-GB" w:eastAsia="es-ES"/>
+        </w:rPr>
+        <w:t>n</w:t>
+      </w:r>
+      <w:r>
+        <w:rPr>
+          <w:b/>
+          <w:sz w:val="24"/>
+          <w:lang w:val="en-GB" w:eastAsia="es-ES"/>
+        </w:rPr>
+        <w:t>;</w:t>
+      </w:r>
+      <w:r>
+        <w:rPr>
+          <w:b/>
+          <w:color w:val="9CDCFE"/>
+          <w:sz w:val="24"/>
+          <w:lang w:val="en-GB" w:eastAsia="es-ES"/>
+        </w:rPr>
+        <w:t>i</w:t>
+      </w:r>
+      <w:proofErr w:type="spellEnd"/>
+      <w:r>
+        <w:rPr>
+          <w:b/>
+          <w:color w:val="D4D4D4"/>
+          <w:sz w:val="24"/>
+          <w:lang w:val="en-GB" w:eastAsia="es-ES"/>
+        </w:rPr>
+        <w:t>++</w:t>
+      </w:r>
+      <w:r>
+        <w:rPr>
+          <w:b/>
+          <w:sz w:val="24"/>
+          <w:lang w:val="en-GB" w:eastAsia="es-ES"/>
+        </w:rPr>
+        <w:t>){</w:t>
+      </w:r>
+    </w:p>
+    <w:p>
+      <w:pPr>
+        <w:pStyle w:val="Textoindependienteprimerasangra2"/>
+        <w:rPr>
+          <w:b/>
+          <w:sz w:val="24"/>
+          <w:lang w:val="en-GB" w:eastAsia="es-ES"/>
+        </w:rPr>
+      </w:pPr>
+      <w:r>
+        <w:rPr>
+          <w:b/>
+          <w:color w:val="C586C0"/>
+          <w:sz w:val="24"/>
+          <w:lang w:val="en-GB" w:eastAsia="es-ES"/>
+        </w:rPr>
+        <w:t>for</w:t>
+      </w:r>
+      <w:r>
+        <w:rPr>
+          <w:b/>
+          <w:sz w:val="24"/>
+          <w:lang w:val="en-GB" w:eastAsia="es-ES"/>
+        </w:rPr>
         <w:t xml:space="preserve"> (</w:t>
       </w:r>
       <w:proofErr w:type="spellStart"/>
@@ -14490,7 +14634,6 @@
         </w:rPr>
         <w:t xml:space="preserve"> </w:t>
       </w:r>
-      <w:proofErr w:type="spellStart"/>
       <w:r>
         <w:rPr>
           <w:b/>
@@ -14498,9 +14641,8 @@
           <w:sz w:val="24"/>
           <w:lang w:val="en-GB" w:eastAsia="es-ES"/>
         </w:rPr>
-        <w:t>i</w:t>
-      </w:r>
-      <w:proofErr w:type="spellEnd"/>
+        <w:t>j</w:t>
+      </w:r>
       <w:r>
         <w:rPr>
           <w:b/>
@@ -14510,6 +14652,7 @@
         </w:rPr>
         <w:t>=</w:t>
       </w:r>
+      <w:proofErr w:type="gramStart"/>
       <w:r>
         <w:rPr>
           <w:b/>
@@ -14534,154 +14677,9 @@
           <w:sz w:val="24"/>
           <w:lang w:val="en-GB" w:eastAsia="es-ES"/>
         </w:rPr>
-        <w:t>i</w:t>
-      </w:r>
-      <w:r>
-        <w:rPr>
-          <w:b/>
-          <w:color w:val="D4D4D4"/>
-          <w:sz w:val="24"/>
-          <w:lang w:val="en-GB" w:eastAsia="es-ES"/>
-        </w:rPr>
-        <w:t>&lt;</w:t>
-      </w:r>
-      <w:proofErr w:type="spellStart"/>
-      <w:r>
-        <w:rPr>
-          <w:b/>
-          <w:color w:val="9CDCFE"/>
-          <w:sz w:val="24"/>
-          <w:lang w:val="en-GB" w:eastAsia="es-ES"/>
-        </w:rPr>
-        <w:t>n</w:t>
-      </w:r>
-      <w:r>
-        <w:rPr>
-          <w:b/>
-          <w:sz w:val="24"/>
-          <w:lang w:val="en-GB" w:eastAsia="es-ES"/>
-        </w:rPr>
-        <w:t>;</w:t>
-      </w:r>
-      <w:r>
-        <w:rPr>
-          <w:b/>
-          <w:color w:val="9CDCFE"/>
-          <w:sz w:val="24"/>
-          <w:lang w:val="en-GB" w:eastAsia="es-ES"/>
-        </w:rPr>
-        <w:t>i</w:t>
-      </w:r>
-      <w:proofErr w:type="spellEnd"/>
-      <w:r>
-        <w:rPr>
-          <w:b/>
-          <w:color w:val="D4D4D4"/>
-          <w:sz w:val="24"/>
-          <w:lang w:val="en-GB" w:eastAsia="es-ES"/>
-        </w:rPr>
-        <w:t>++</w:t>
-      </w:r>
-      <w:r>
-        <w:rPr>
-          <w:b/>
-          <w:sz w:val="24"/>
-          <w:lang w:val="en-GB" w:eastAsia="es-ES"/>
-        </w:rPr>
-        <w:t>){</w:t>
-      </w:r>
-    </w:p>
-    <w:p>
-      <w:pPr>
-        <w:pStyle w:val="Textoindependienteprimerasangra2"/>
-        <w:rPr>
-          <w:b/>
-          <w:sz w:val="24"/>
-          <w:lang w:val="en-GB" w:eastAsia="es-ES"/>
-        </w:rPr>
-      </w:pPr>
-      <w:proofErr w:type="gramStart"/>
-      <w:r>
-        <w:rPr>
-          <w:b/>
-          <w:color w:val="C586C0"/>
-          <w:sz w:val="24"/>
-          <w:lang w:val="en-GB" w:eastAsia="es-ES"/>
-        </w:rPr>
-        <w:t>for</w:t>
+        <w:t>j</w:t>
       </w:r>
       <w:proofErr w:type="gramEnd"/>
-      <w:r>
-        <w:rPr>
-          <w:b/>
-          <w:sz w:val="24"/>
-          <w:lang w:val="en-GB" w:eastAsia="es-ES"/>
-        </w:rPr>
-        <w:t xml:space="preserve"> (</w:t>
-      </w:r>
-      <w:proofErr w:type="spellStart"/>
-      <w:r>
-        <w:rPr>
-          <w:b/>
-          <w:color w:val="4EC9B0"/>
-          <w:sz w:val="24"/>
-          <w:lang w:val="en-GB" w:eastAsia="es-ES"/>
-        </w:rPr>
-        <w:t>int</w:t>
-      </w:r>
-      <w:proofErr w:type="spellEnd"/>
-      <w:r>
-        <w:rPr>
-          <w:b/>
-          <w:sz w:val="24"/>
-          <w:lang w:val="en-GB" w:eastAsia="es-ES"/>
-        </w:rPr>
-        <w:t xml:space="preserve"> </w:t>
-      </w:r>
-      <w:r>
-        <w:rPr>
-          <w:b/>
-          <w:color w:val="9CDCFE"/>
-          <w:sz w:val="24"/>
-          <w:lang w:val="en-GB" w:eastAsia="es-ES"/>
-        </w:rPr>
-        <w:t>j</w:t>
-      </w:r>
-      <w:r>
-        <w:rPr>
-          <w:b/>
-          <w:color w:val="D4D4D4"/>
-          <w:sz w:val="24"/>
-          <w:lang w:val="en-GB" w:eastAsia="es-ES"/>
-        </w:rPr>
-        <w:t>=</w:t>
-      </w:r>
-      <w:r>
-        <w:rPr>
-          <w:b/>
-          <w:color w:val="B5CEA8"/>
-          <w:sz w:val="24"/>
-          <w:lang w:val="en-GB" w:eastAsia="es-ES"/>
-        </w:rPr>
-        <w:t>0</w:t>
-      </w:r>
-      <w:r>
-        <w:rPr>
-          <w:b/>
-          <w:sz w:val="24"/>
-          <w:lang w:val="en-GB" w:eastAsia="es-ES"/>
-        </w:rPr>
-        <w:t>;</w:t>
-      </w:r>
-      <w:r>
-        <w:rPr>
-          <w:b/>
-          <w:color w:val="9CDCFE"/>
-          <w:sz w:val="24"/>
-          <w:lang w:val="en-GB" w:eastAsia="es-ES"/>
-        </w:rPr>
-        <w:t>j</w:t>
-      </w:r>
       <w:r>
         <w:rPr>
           <w:b/>
@@ -15543,7 +15541,6 @@
           <w:lang w:val="en-GB" w:eastAsia="es-ES"/>
         </w:rPr>
       </w:pPr>
-      <w:proofErr w:type="gramStart"/>
       <w:r>
         <w:rPr>
           <w:b/>
@@ -15552,7 +15549,6 @@
         </w:rPr>
         <w:t>public</w:t>
       </w:r>
-      <w:proofErr w:type="gramEnd"/>
       <w:r>
         <w:rPr>
           <w:b/>
@@ -15828,39 +15824,53 @@
         </w:rPr>
       </w:pPr>
       <w:proofErr w:type="spellStart"/>
+      <w:r>
+        <w:rPr>
+          <w:color w:val="9CDCFE"/>
+          <w:sz w:val="24"/>
+          <w:lang w:val="en-GB" w:eastAsia="es-ES"/>
+        </w:rPr>
+        <w:t>cont</w:t>
+      </w:r>
+      <w:proofErr w:type="spellEnd"/>
+      <w:r>
+        <w:rPr>
+          <w:color w:val="D4D4D4"/>
+          <w:sz w:val="24"/>
+          <w:lang w:val="en-GB" w:eastAsia="es-ES"/>
+        </w:rPr>
+        <w:t>++</w:t>
+      </w:r>
+      <w:r>
+        <w:rPr>
+          <w:color w:val="CCCCCC"/>
+          <w:sz w:val="24"/>
+          <w:lang w:val="en-GB" w:eastAsia="es-ES"/>
+        </w:rPr>
+        <w:t xml:space="preserve">;   </w:t>
+      </w:r>
+      <w:r>
+        <w:rPr>
+          <w:sz w:val="24"/>
+          <w:lang w:val="en-GB" w:eastAsia="es-ES"/>
+        </w:rPr>
+        <w:t xml:space="preserve">// </w:t>
+      </w:r>
       <w:proofErr w:type="gramStart"/>
       <w:r>
         <w:rPr>
-          <w:color w:val="9CDCFE"/>
           <w:sz w:val="24"/>
           <w:lang w:val="en-GB" w:eastAsia="es-ES"/>
         </w:rPr>
-        <w:t>cont</w:t>
-      </w:r>
-      <w:proofErr w:type="spellEnd"/>
+        <w:t>O(</w:t>
+      </w:r>
       <w:proofErr w:type="gramEnd"/>
       <w:r>
         <w:rPr>
-          <w:color w:val="D4D4D4"/>
           <w:sz w:val="24"/>
           <w:lang w:val="en-GB" w:eastAsia="es-ES"/>
         </w:rPr>
-        <w:t>++</w:t>
-      </w:r>
-      <w:r>
-        <w:rPr>
-          <w:color w:val="CCCCCC"/>
-          <w:sz w:val="24"/>
-          <w:lang w:val="en-GB" w:eastAsia="es-ES"/>
-        </w:rPr>
-        <w:t xml:space="preserve">;   </w:t>
-      </w:r>
-      <w:r>
-        <w:rPr>
-          <w:sz w:val="24"/>
-          <w:lang w:val="en-GB" w:eastAsia="es-ES"/>
-        </w:rPr>
-        <w:t>// O(1)    </w:t>
+        <w:t>1)    </w:t>
       </w:r>
     </w:p>
     <w:p>
@@ -17080,7 +17090,6 @@
           <w:lang w:val="en-GB" w:eastAsia="es-ES"/>
         </w:rPr>
       </w:pPr>
-      <w:proofErr w:type="gramStart"/>
       <w:r>
         <w:rPr>
           <w:b/>
@@ -17089,7 +17098,6 @@
         </w:rPr>
         <w:t>public</w:t>
       </w:r>
-      <w:proofErr w:type="gramEnd"/>
       <w:r>
         <w:rPr>
           <w:b/>
@@ -17222,7 +17230,6 @@
           <w:lang w:val="en-GB" w:eastAsia="es-ES"/>
         </w:rPr>
       </w:pPr>
-      <w:proofErr w:type="gramStart"/>
       <w:r>
         <w:rPr>
           <w:b/>
@@ -17232,7 +17239,6 @@
         </w:rPr>
         <w:t>if</w:t>
       </w:r>
-      <w:proofErr w:type="gramEnd"/>
       <w:r>
         <w:rPr>
           <w:b/>
@@ -17355,81 +17361,81 @@
           <w:lang w:val="en-GB" w:eastAsia="es-ES"/>
         </w:rPr>
       </w:pPr>
+      <w:r>
+        <w:rPr>
+          <w:b/>
+          <w:color w:val="C586C0"/>
+          <w:sz w:val="24"/>
+          <w:lang w:val="en-GB" w:eastAsia="es-ES"/>
+        </w:rPr>
+        <w:t>for</w:t>
+      </w:r>
+      <w:r>
+        <w:rPr>
+          <w:b/>
+          <w:sz w:val="24"/>
+          <w:lang w:val="en-GB" w:eastAsia="es-ES"/>
+        </w:rPr>
+        <w:t xml:space="preserve"> (</w:t>
+      </w:r>
+      <w:proofErr w:type="spellStart"/>
+      <w:r>
+        <w:rPr>
+          <w:b/>
+          <w:color w:val="4EC9B0"/>
+          <w:sz w:val="24"/>
+          <w:lang w:val="en-GB" w:eastAsia="es-ES"/>
+        </w:rPr>
+        <w:t>int</w:t>
+      </w:r>
+      <w:proofErr w:type="spellEnd"/>
+      <w:r>
+        <w:rPr>
+          <w:b/>
+          <w:sz w:val="24"/>
+          <w:lang w:val="en-GB" w:eastAsia="es-ES"/>
+        </w:rPr>
+        <w:t xml:space="preserve"> </w:t>
+      </w:r>
+      <w:proofErr w:type="spellStart"/>
+      <w:r>
+        <w:rPr>
+          <w:b/>
+          <w:color w:val="9CDCFE"/>
+          <w:sz w:val="24"/>
+          <w:lang w:val="en-GB" w:eastAsia="es-ES"/>
+        </w:rPr>
+        <w:t>i</w:t>
+      </w:r>
+      <w:proofErr w:type="spellEnd"/>
+      <w:r>
+        <w:rPr>
+          <w:b/>
+          <w:color w:val="D4D4D4"/>
+          <w:sz w:val="24"/>
+          <w:lang w:val="en-GB" w:eastAsia="es-ES"/>
+        </w:rPr>
+        <w:t>=</w:t>
+      </w:r>
       <w:proofErr w:type="gramStart"/>
       <w:r>
         <w:rPr>
           <w:b/>
-          <w:color w:val="C586C0"/>
+          <w:color w:val="B5CEA8"/>
           <w:sz w:val="24"/>
           <w:lang w:val="en-GB" w:eastAsia="es-ES"/>
         </w:rPr>
-        <w:t>for</w:t>
+        <w:t>1</w:t>
+      </w:r>
+      <w:r>
+        <w:rPr>
+          <w:b/>
+          <w:sz w:val="24"/>
+          <w:lang w:val="en-GB" w:eastAsia="es-ES"/>
+        </w:rPr>
+        <w:t>;i</w:t>
       </w:r>
       <w:proofErr w:type="gramEnd"/>
-      <w:r>
-        <w:rPr>
-          <w:b/>
-          <w:sz w:val="24"/>
-          <w:lang w:val="en-GB" w:eastAsia="es-ES"/>
-        </w:rPr>
-        <w:t xml:space="preserve"> (</w:t>
-      </w:r>
-      <w:proofErr w:type="spellStart"/>
-      <w:r>
-        <w:rPr>
-          <w:b/>
-          <w:color w:val="4EC9B0"/>
-          <w:sz w:val="24"/>
-          <w:lang w:val="en-GB" w:eastAsia="es-ES"/>
-        </w:rPr>
-        <w:t>int</w:t>
-      </w:r>
-      <w:proofErr w:type="spellEnd"/>
-      <w:r>
-        <w:rPr>
-          <w:b/>
-          <w:sz w:val="24"/>
-          <w:lang w:val="en-GB" w:eastAsia="es-ES"/>
-        </w:rPr>
-        <w:t xml:space="preserve"> </w:t>
-      </w:r>
-      <w:proofErr w:type="spellStart"/>
-      <w:r>
-        <w:rPr>
-          <w:b/>
-          <w:color w:val="9CDCFE"/>
-          <w:sz w:val="24"/>
-          <w:lang w:val="en-GB" w:eastAsia="es-ES"/>
-        </w:rPr>
-        <w:t>i</w:t>
-      </w:r>
-      <w:proofErr w:type="spellEnd"/>
-      <w:r>
-        <w:rPr>
-          <w:b/>
-          <w:color w:val="D4D4D4"/>
-          <w:sz w:val="24"/>
-          <w:lang w:val="en-GB" w:eastAsia="es-ES"/>
-        </w:rPr>
-        <w:t>=</w:t>
-      </w:r>
-      <w:r>
-        <w:rPr>
-          <w:b/>
-          <w:color w:val="B5CEA8"/>
-          <w:sz w:val="24"/>
-          <w:lang w:val="en-GB" w:eastAsia="es-ES"/>
-        </w:rPr>
-        <w:t>1</w:t>
-      </w:r>
-      <w:r>
-        <w:rPr>
-          <w:b/>
-          <w:sz w:val="24"/>
-          <w:lang w:val="en-GB" w:eastAsia="es-ES"/>
-        </w:rPr>
-        <w:t>;i</w:t>
-      </w:r>
       <w:r>
         <w:rPr>
           <w:b/>
@@ -17508,81 +17514,81 @@
           <w:lang w:val="en-GB" w:eastAsia="es-ES"/>
         </w:rPr>
       </w:pPr>
+      <w:r>
+        <w:rPr>
+          <w:b/>
+          <w:color w:val="C586C0"/>
+          <w:sz w:val="24"/>
+          <w:lang w:val="en-GB" w:eastAsia="es-ES"/>
+        </w:rPr>
+        <w:t>for</w:t>
+      </w:r>
+      <w:r>
+        <w:rPr>
+          <w:b/>
+          <w:sz w:val="24"/>
+          <w:lang w:val="en-GB" w:eastAsia="es-ES"/>
+        </w:rPr>
+        <w:t xml:space="preserve"> (</w:t>
+      </w:r>
+      <w:proofErr w:type="spellStart"/>
+      <w:r>
+        <w:rPr>
+          <w:b/>
+          <w:color w:val="4EC9B0"/>
+          <w:sz w:val="24"/>
+          <w:lang w:val="en-GB" w:eastAsia="es-ES"/>
+        </w:rPr>
+        <w:t>int</w:t>
+      </w:r>
+      <w:proofErr w:type="spellEnd"/>
+      <w:r>
+        <w:rPr>
+          <w:b/>
+          <w:sz w:val="24"/>
+          <w:lang w:val="en-GB" w:eastAsia="es-ES"/>
+        </w:rPr>
+        <w:t xml:space="preserve"> </w:t>
+      </w:r>
+      <w:proofErr w:type="spellStart"/>
+      <w:r>
+        <w:rPr>
+          <w:b/>
+          <w:color w:val="9CDCFE"/>
+          <w:sz w:val="24"/>
+          <w:lang w:val="en-GB" w:eastAsia="es-ES"/>
+        </w:rPr>
+        <w:t>i</w:t>
+      </w:r>
+      <w:proofErr w:type="spellEnd"/>
+      <w:r>
+        <w:rPr>
+          <w:b/>
+          <w:color w:val="D4D4D4"/>
+          <w:sz w:val="24"/>
+          <w:lang w:val="en-GB" w:eastAsia="es-ES"/>
+        </w:rPr>
+        <w:t>=</w:t>
+      </w:r>
       <w:proofErr w:type="gramStart"/>
       <w:r>
         <w:rPr>
           <w:b/>
-          <w:color w:val="C586C0"/>
+          <w:color w:val="B5CEA8"/>
           <w:sz w:val="24"/>
           <w:lang w:val="en-GB" w:eastAsia="es-ES"/>
         </w:rPr>
-        <w:t>for</w:t>
+        <w:t>1</w:t>
+      </w:r>
+      <w:r>
+        <w:rPr>
+          <w:b/>
+          <w:sz w:val="24"/>
+          <w:lang w:val="en-GB" w:eastAsia="es-ES"/>
+        </w:rPr>
+        <w:t>;i</w:t>
       </w:r>
       <w:proofErr w:type="gramEnd"/>
-      <w:r>
-        <w:rPr>
-          <w:b/>
-          <w:sz w:val="24"/>
-          <w:lang w:val="en-GB" w:eastAsia="es-ES"/>
-        </w:rPr>
-        <w:t xml:space="preserve"> (</w:t>
-      </w:r>
-      <w:proofErr w:type="spellStart"/>
-      <w:r>
-        <w:rPr>
-          <w:b/>
-          <w:color w:val="4EC9B0"/>
-          <w:sz w:val="24"/>
-          <w:lang w:val="en-GB" w:eastAsia="es-ES"/>
-        </w:rPr>
-        <w:t>int</w:t>
-      </w:r>
-      <w:proofErr w:type="spellEnd"/>
-      <w:r>
-        <w:rPr>
-          <w:b/>
-          <w:sz w:val="24"/>
-          <w:lang w:val="en-GB" w:eastAsia="es-ES"/>
-        </w:rPr>
-        <w:t xml:space="preserve"> </w:t>
-      </w:r>
-      <w:proofErr w:type="spellStart"/>
-      <w:r>
-        <w:rPr>
-          <w:b/>
-          <w:color w:val="9CDCFE"/>
-          <w:sz w:val="24"/>
-          <w:lang w:val="en-GB" w:eastAsia="es-ES"/>
-        </w:rPr>
-        <w:t>i</w:t>
-      </w:r>
-      <w:proofErr w:type="spellEnd"/>
-      <w:r>
-        <w:rPr>
-          <w:b/>
-          <w:color w:val="D4D4D4"/>
-          <w:sz w:val="24"/>
-          <w:lang w:val="en-GB" w:eastAsia="es-ES"/>
-        </w:rPr>
-        <w:t>=</w:t>
-      </w:r>
-      <w:r>
-        <w:rPr>
-          <w:b/>
-          <w:color w:val="B5CEA8"/>
-          <w:sz w:val="24"/>
-          <w:lang w:val="en-GB" w:eastAsia="es-ES"/>
-        </w:rPr>
-        <w:t>1</w:t>
-      </w:r>
-      <w:r>
-        <w:rPr>
-          <w:b/>
-          <w:sz w:val="24"/>
-          <w:lang w:val="en-GB" w:eastAsia="es-ES"/>
-        </w:rPr>
-        <w:t>;i</w:t>
-      </w:r>
       <w:r>
         <w:rPr>
           <w:b/>
@@ -17651,7 +17657,6 @@
           <w:lang w:val="en-GB" w:eastAsia="es-ES"/>
         </w:rPr>
       </w:pPr>
-      <w:proofErr w:type="gramStart"/>
       <w:r>
         <w:rPr>
           <w:b/>
@@ -17660,7 +17665,6 @@
         </w:rPr>
         <w:t>count</w:t>
       </w:r>
-      <w:proofErr w:type="gramEnd"/>
       <w:r>
         <w:rPr>
           <w:b/>
@@ -17957,7 +17961,6 @@
           <w:lang w:val="en-GB" w:eastAsia="es-ES"/>
         </w:rPr>
       </w:pPr>
-      <w:proofErr w:type="gramStart"/>
       <w:r>
         <w:rPr>
           <w:b/>
@@ -17966,7 +17969,6 @@
         </w:rPr>
         <w:t>public</w:t>
       </w:r>
-      <w:proofErr w:type="gramEnd"/>
       <w:r>
         <w:rPr>
           <w:b/>
@@ -18099,7 +18101,6 @@
           <w:lang w:val="en-GB" w:eastAsia="es-ES"/>
         </w:rPr>
       </w:pPr>
-      <w:proofErr w:type="gramStart"/>
       <w:r>
         <w:rPr>
           <w:b/>
@@ -18109,7 +18110,6 @@
         </w:rPr>
         <w:t>if</w:t>
       </w:r>
-      <w:proofErr w:type="gramEnd"/>
       <w:r>
         <w:rPr>
           <w:b/>
@@ -18155,7 +18155,6 @@
         </w:rPr>
       </w:pPr>
       <w:proofErr w:type="spellStart"/>
-      <w:proofErr w:type="gramStart"/>
       <w:r>
         <w:rPr>
           <w:b/>
@@ -18165,7 +18164,6 @@
         <w:t>cont</w:t>
       </w:r>
       <w:proofErr w:type="spellEnd"/>
-      <w:proofErr w:type="gramEnd"/>
       <w:r>
         <w:rPr>
           <w:b/>
@@ -18194,7 +18192,6 @@
           <w:lang w:val="en-GB" w:eastAsia="es-ES"/>
         </w:rPr>
       </w:pPr>
-      <w:proofErr w:type="gramStart"/>
       <w:r>
         <w:rPr>
           <w:b/>
@@ -18203,7 +18200,6 @@
         </w:rPr>
         <w:t>else</w:t>
       </w:r>
-      <w:proofErr w:type="gramEnd"/>
     </w:p>
     <w:p>
       <w:pPr>
@@ -20559,38 +20555,323 @@
           <w:sz w:val="24"/>
           <w:szCs w:val="24"/>
         </w:rPr>
-        <w:t>Razone convenientemente la complejidad temporal del algoritmo implementado.</w:t>
+        <w:t xml:space="preserve">Implementar una clase ColoreoGrafo.java, de modo que con la clase proporcionada Devorador.java podamos calcular una solución y visualizarla con el módulo proporcionado en Python. Se debe añadir el JAR provisto al </w:t>
+      </w:r>
+      <w:proofErr w:type="spellStart"/>
+      <w:r>
+        <w:rPr>
+          <w:b/>
+          <w:sz w:val="24"/>
+          <w:szCs w:val="24"/>
+        </w:rPr>
+        <w:t>build</w:t>
+      </w:r>
+      <w:proofErr w:type="spellEnd"/>
+      <w:r>
+        <w:rPr>
+          <w:b/>
+          <w:sz w:val="24"/>
+          <w:szCs w:val="24"/>
+        </w:rPr>
+        <w:t xml:space="preserve"> </w:t>
+      </w:r>
+      <w:proofErr w:type="spellStart"/>
+      <w:r>
+        <w:rPr>
+          <w:b/>
+          <w:sz w:val="24"/>
+          <w:szCs w:val="24"/>
+        </w:rPr>
+        <w:t>path</w:t>
+      </w:r>
+      <w:proofErr w:type="spellEnd"/>
+      <w:r>
+        <w:rPr>
+          <w:b/>
+          <w:sz w:val="24"/>
+          <w:szCs w:val="24"/>
+        </w:rPr>
+        <w:t xml:space="preserve"> para que este último funcione.</w:t>
+      </w:r>
+      <w:r>
+        <w:rPr>
+          <w:b/>
+          <w:sz w:val="24"/>
+          <w:szCs w:val="24"/>
+        </w:rPr>
+        <w:t xml:space="preserve"> </w:t>
+      </w:r>
+      <w:proofErr w:type="gramStart"/>
+      <w:r>
+        <w:rPr>
+          <w:b/>
+          <w:sz w:val="24"/>
+          <w:szCs w:val="24"/>
+        </w:rPr>
+        <w:t>Razone</w:t>
+      </w:r>
+      <w:proofErr w:type="gramEnd"/>
+      <w:r>
+        <w:rPr>
+          <w:b/>
+          <w:sz w:val="24"/>
+          <w:szCs w:val="24"/>
+        </w:rPr>
+        <w:t xml:space="preserve"> convenientemente la complejidad temporal del algoritmo implementado.</w:t>
       </w:r>
     </w:p>
     <w:p>
       <w:pPr>
         <w:pStyle w:val="Textoindependiente"/>
         <w:rPr>
+          <w:sz w:val="24"/>
           <w:szCs w:val="24"/>
         </w:rPr>
       </w:pPr>
       <w:r>
         <w:rPr>
+          <w:sz w:val="24"/>
           <w:szCs w:val="24"/>
         </w:rPr>
-        <w:t>as</w:t>
+        <w:t xml:space="preserve">El algoritmo recorre todos los nodos del grafo </w:t>
+      </w:r>
+      <w:r>
+        <w:rPr>
+          <w:sz w:val="24"/>
+          <w:szCs w:val="24"/>
+        </w:rPr>
+        <w:t>y para</w:t>
+      </w:r>
+      <w:r>
+        <w:rPr>
+          <w:sz w:val="24"/>
+          <w:szCs w:val="24"/>
+        </w:rPr>
+        <w:t xml:space="preserve"> cada nodo se recorren sus vecinos utilizando la lista de ad</w:t>
+      </w:r>
+      <w:r>
+        <w:rPr>
+          <w:sz w:val="24"/>
+          <w:szCs w:val="24"/>
+        </w:rPr>
+        <w:t xml:space="preserve">yacencia del </w:t>
+      </w:r>
+      <w:proofErr w:type="spellStart"/>
+      <w:r>
+        <w:rPr>
+          <w:sz w:val="24"/>
+          <w:szCs w:val="24"/>
+        </w:rPr>
+        <w:t>map</w:t>
+      </w:r>
+      <w:proofErr w:type="spellEnd"/>
+      <w:r>
+        <w:rPr>
+          <w:sz w:val="24"/>
+          <w:szCs w:val="24"/>
+        </w:rPr>
+        <w:t>.</w:t>
       </w:r>
     </w:p>
     <w:p>
       <w:pPr>
         <w:pStyle w:val="Textoindependiente"/>
         <w:rPr>
-          <w:b/>
           <w:sz w:val="24"/>
           <w:szCs w:val="24"/>
         </w:rPr>
       </w:pPr>
       <w:r>
         <w:rPr>
-          <w:b/>
           <w:sz w:val="24"/>
           <w:szCs w:val="24"/>
         </w:rPr>
+        <w:t>Si n es el número de nodos y A</w:t>
+      </w:r>
+      <w:r>
+        <w:rPr>
+          <w:sz w:val="24"/>
+          <w:szCs w:val="24"/>
+        </w:rPr>
+        <w:t xml:space="preserve"> el número de aristas</w:t>
+      </w:r>
+      <w:r>
+        <w:rPr>
+          <w:sz w:val="24"/>
+          <w:szCs w:val="24"/>
+        </w:rPr>
+        <w:t>, recorrer todos los nodos</w:t>
+      </w:r>
+      <w:r>
+        <w:rPr>
+          <w:sz w:val="24"/>
+          <w:szCs w:val="24"/>
+        </w:rPr>
+        <w:t xml:space="preserve"> tiene co</w:t>
+      </w:r>
+      <w:r>
+        <w:rPr>
+          <w:sz w:val="24"/>
+          <w:szCs w:val="24"/>
+        </w:rPr>
+        <w:t xml:space="preserve">ste </w:t>
+      </w:r>
+      <w:r>
+        <w:rPr>
+          <w:sz w:val="24"/>
+          <w:szCs w:val="24"/>
+        </w:rPr>
+        <w:t xml:space="preserve">O(n), mientras que </w:t>
+      </w:r>
+      <w:r>
+        <w:rPr>
+          <w:sz w:val="24"/>
+          <w:szCs w:val="24"/>
+        </w:rPr>
+        <w:t>recorrer</w:t>
+      </w:r>
+      <w:r>
+        <w:rPr>
+          <w:sz w:val="24"/>
+          <w:szCs w:val="24"/>
+        </w:rPr>
+        <w:t xml:space="preserve"> todos los vecinos de cada nodo equivale a </w:t>
+      </w:r>
+      <w:r>
+        <w:rPr>
+          <w:sz w:val="24"/>
+          <w:szCs w:val="24"/>
+        </w:rPr>
+        <w:t>recorrer las aristas del grafo (de cada arista sale un nodo).</w:t>
+      </w:r>
+    </w:p>
+    <w:p>
+      <w:pPr>
+        <w:pStyle w:val="Textoindependiente"/>
+        <w:rPr>
+          <w:sz w:val="24"/>
+          <w:szCs w:val="24"/>
+        </w:rPr>
+      </w:pPr>
+      <w:r>
+        <w:rPr>
+          <w:sz w:val="24"/>
+          <w:szCs w:val="24"/>
+        </w:rPr>
+        <w:t>Por tanto, la comp</w:t>
+      </w:r>
+      <w:r>
+        <w:rPr>
+          <w:sz w:val="24"/>
+          <w:szCs w:val="24"/>
+        </w:rPr>
+        <w:t>lejidad total del algoritmo es O(</w:t>
+      </w:r>
+      <w:proofErr w:type="spellStart"/>
+      <w:r>
+        <w:rPr>
+          <w:sz w:val="24"/>
+          <w:szCs w:val="24"/>
+        </w:rPr>
+        <w:t>n+A</w:t>
+      </w:r>
+      <w:proofErr w:type="spellEnd"/>
+      <w:r>
+        <w:rPr>
+          <w:sz w:val="24"/>
+          <w:szCs w:val="24"/>
+        </w:rPr>
+        <w:t>)</w:t>
+      </w:r>
+    </w:p>
+    <w:p>
+      <w:pPr>
+        <w:pStyle w:val="Textoindependiente"/>
+        <w:rPr>
+          <w:sz w:val="24"/>
+          <w:szCs w:val="24"/>
+        </w:rPr>
+      </w:pPr>
+      <w:r>
+        <w:rPr>
+          <w:sz w:val="24"/>
+          <w:szCs w:val="24"/>
+        </w:rPr>
+        <w:t>En grafos dispersos, es decir, con pocas aristas (donde A</w:t>
+      </w:r>
+      <w:r>
+        <w:rPr>
+          <w:sz w:val="24"/>
+          <w:szCs w:val="24"/>
+        </w:rPr>
+        <w:t xml:space="preserve"> </w:t>
+      </w:r>
+      <w:r>
+        <w:rPr>
+          <w:sz w:val="24"/>
+          <w:szCs w:val="24"/>
+        </w:rPr>
+        <w:t xml:space="preserve">se aproxima a </w:t>
+      </w:r>
+      <w:r>
+        <w:rPr>
+          <w:sz w:val="24"/>
+          <w:szCs w:val="24"/>
+        </w:rPr>
+        <w:t xml:space="preserve">n) el coste es aproximadamente lineal, mientras que en grafos densos (donde </w:t>
+      </w:r>
+      <w:r>
+        <w:rPr>
+          <w:sz w:val="24"/>
+          <w:szCs w:val="24"/>
+        </w:rPr>
+        <w:t>E es más o menos n</w:t>
+      </w:r>
+      <w:r>
+        <w:rPr>
+          <w:sz w:val="24"/>
+          <w:szCs w:val="24"/>
+          <w:vertAlign w:val="superscript"/>
+        </w:rPr>
+        <w:t>2</w:t>
+      </w:r>
+      <w:r>
+        <w:rPr>
+          <w:sz w:val="24"/>
+          <w:szCs w:val="24"/>
+        </w:rPr>
+        <w:t>) el coste puede aproximarse a O(n</w:t>
+      </w:r>
+      <w:r>
+        <w:rPr>
+          <w:sz w:val="24"/>
+          <w:szCs w:val="24"/>
+          <w:vertAlign w:val="superscript"/>
+        </w:rPr>
+        <w:t>2</w:t>
+      </w:r>
+      <w:r>
+        <w:rPr>
+          <w:sz w:val="24"/>
+          <w:szCs w:val="24"/>
+        </w:rPr>
+        <w:t>).</w:t>
+      </w:r>
+    </w:p>
+    <w:p>
+      <w:pPr>
+        <w:pStyle w:val="Textoindependiente"/>
+        <w:rPr>
+          <w:sz w:val="24"/>
+          <w:szCs w:val="24"/>
+        </w:rPr>
+      </w:pPr>
+      <w:r>
+        <w:rPr>
+          <w:b/>
+          <w:sz w:val="24"/>
+          <w:szCs w:val="24"/>
+        </w:rPr>
         <w:t xml:space="preserve">Implementar una clase DevoradorTiempos.java, que emplee los grafos contenidos en </w:t>
       </w:r>
       <w:proofErr w:type="spellStart"/>
@@ -20630,11 +20911,720 @@
         <w:t>Razone: ¿siguen la complejidad calculada los tiempos de la tabla?</w:t>
       </w:r>
     </w:p>
+    <w:tbl>
+      <w:tblPr>
+        <w:tblStyle w:val="Tablaconcuadrcula"/>
+        <w:tblW w:w="0" w:type="auto"/>
+        <w:tblInd w:w="2263" w:type="dxa"/>
+        <w:tblLook w:val="04A0" w:firstRow="1" w:lastRow="0" w:firstColumn="1" w:lastColumn="0" w:noHBand="0" w:noVBand="1"/>
+      </w:tblPr>
+      <w:tblGrid>
+        <w:gridCol w:w="1984"/>
+        <w:gridCol w:w="3119"/>
+      </w:tblGrid>
+      <w:tr>
+        <w:tc>
+          <w:tcPr>
+            <w:tcW w:w="1984" w:type="dxa"/>
+          </w:tcPr>
+          <w:p>
+            <w:pPr>
+              <w:pStyle w:val="Textoindependiente"/>
+              <w:jc w:val="center"/>
+              <w:rPr>
+                <w:b/>
+                <w:sz w:val="24"/>
+                <w:szCs w:val="24"/>
+              </w:rPr>
+            </w:pPr>
+            <w:r>
+              <w:rPr>
+                <w:b/>
+                <w:sz w:val="24"/>
+                <w:szCs w:val="24"/>
+              </w:rPr>
+              <w:t>n</w:t>
+            </w:r>
+          </w:p>
+        </w:tc>
+        <w:tc>
+          <w:tcPr>
+            <w:tcW w:w="3119" w:type="dxa"/>
+          </w:tcPr>
+          <w:p>
+            <w:pPr>
+              <w:pStyle w:val="Textoindependiente"/>
+              <w:jc w:val="center"/>
+              <w:rPr>
+                <w:b/>
+                <w:sz w:val="24"/>
+                <w:szCs w:val="24"/>
+              </w:rPr>
+            </w:pPr>
+            <w:r>
+              <w:rPr>
+                <w:b/>
+                <w:sz w:val="24"/>
+                <w:szCs w:val="24"/>
+              </w:rPr>
+              <w:t>t Coloreado (ms)</w:t>
+            </w:r>
+          </w:p>
+        </w:tc>
+      </w:tr>
+      <w:tr>
+        <w:tc>
+          <w:tcPr>
+            <w:tcW w:w="1984" w:type="dxa"/>
+          </w:tcPr>
+          <w:p>
+            <w:pPr>
+              <w:pStyle w:val="Textoindependiente"/>
+              <w:jc w:val="center"/>
+              <w:rPr>
+                <w:i/>
+                <w:sz w:val="24"/>
+                <w:szCs w:val="24"/>
+              </w:rPr>
+            </w:pPr>
+            <w:r>
+              <w:rPr>
+                <w:i/>
+                <w:sz w:val="24"/>
+                <w:szCs w:val="24"/>
+              </w:rPr>
+              <w:t>4</w:t>
+            </w:r>
+          </w:p>
+        </w:tc>
+        <w:tc>
+          <w:tcPr>
+            <w:tcW w:w="3119" w:type="dxa"/>
+          </w:tcPr>
+          <w:p>
+            <w:pPr>
+              <w:pStyle w:val="Textoindependiente"/>
+              <w:jc w:val="center"/>
+              <w:rPr>
+                <w:sz w:val="24"/>
+                <w:szCs w:val="24"/>
+              </w:rPr>
+            </w:pPr>
+          </w:p>
+        </w:tc>
+      </w:tr>
+      <w:tr>
+        <w:tc>
+          <w:tcPr>
+            <w:tcW w:w="1984" w:type="dxa"/>
+          </w:tcPr>
+          <w:p>
+            <w:pPr>
+              <w:pStyle w:val="Textoindependiente"/>
+              <w:jc w:val="center"/>
+              <w:rPr>
+                <w:i/>
+                <w:sz w:val="24"/>
+                <w:szCs w:val="24"/>
+              </w:rPr>
+            </w:pPr>
+            <w:r>
+              <w:rPr>
+                <w:i/>
+                <w:sz w:val="24"/>
+                <w:szCs w:val="24"/>
+              </w:rPr>
+              <w:t>8</w:t>
+            </w:r>
+          </w:p>
+        </w:tc>
+        <w:tc>
+          <w:tcPr>
+            <w:tcW w:w="3119" w:type="dxa"/>
+          </w:tcPr>
+          <w:p>
+            <w:pPr>
+              <w:pStyle w:val="Textoindependiente"/>
+              <w:jc w:val="center"/>
+              <w:rPr>
+                <w:sz w:val="24"/>
+                <w:szCs w:val="24"/>
+              </w:rPr>
+            </w:pPr>
+          </w:p>
+        </w:tc>
+      </w:tr>
+      <w:tr>
+        <w:tc>
+          <w:tcPr>
+            <w:tcW w:w="1984" w:type="dxa"/>
+          </w:tcPr>
+          <w:p>
+            <w:pPr>
+              <w:pStyle w:val="Textoindependiente"/>
+              <w:jc w:val="center"/>
+              <w:rPr>
+                <w:i/>
+                <w:sz w:val="24"/>
+                <w:szCs w:val="24"/>
+              </w:rPr>
+            </w:pPr>
+            <w:r>
+              <w:rPr>
+                <w:i/>
+                <w:sz w:val="24"/>
+                <w:szCs w:val="24"/>
+              </w:rPr>
+              <w:t>16</w:t>
+            </w:r>
+          </w:p>
+        </w:tc>
+        <w:tc>
+          <w:tcPr>
+            <w:tcW w:w="3119" w:type="dxa"/>
+          </w:tcPr>
+          <w:p>
+            <w:pPr>
+              <w:pStyle w:val="Textoindependiente"/>
+              <w:jc w:val="center"/>
+              <w:rPr>
+                <w:sz w:val="24"/>
+                <w:szCs w:val="24"/>
+              </w:rPr>
+            </w:pPr>
+          </w:p>
+        </w:tc>
+      </w:tr>
+      <w:tr>
+        <w:tc>
+          <w:tcPr>
+            <w:tcW w:w="1984" w:type="dxa"/>
+          </w:tcPr>
+          <w:p>
+            <w:pPr>
+              <w:pStyle w:val="Textoindependiente"/>
+              <w:jc w:val="center"/>
+              <w:rPr>
+                <w:i/>
+                <w:sz w:val="24"/>
+                <w:szCs w:val="24"/>
+              </w:rPr>
+            </w:pPr>
+            <w:r>
+              <w:rPr>
+                <w:i/>
+                <w:sz w:val="24"/>
+                <w:szCs w:val="24"/>
+              </w:rPr>
+              <w:t>32</w:t>
+            </w:r>
+          </w:p>
+        </w:tc>
+        <w:tc>
+          <w:tcPr>
+            <w:tcW w:w="3119" w:type="dxa"/>
+          </w:tcPr>
+          <w:p>
+            <w:pPr>
+              <w:pStyle w:val="Textoindependiente"/>
+              <w:jc w:val="center"/>
+              <w:rPr>
+                <w:sz w:val="24"/>
+                <w:szCs w:val="24"/>
+              </w:rPr>
+            </w:pPr>
+          </w:p>
+        </w:tc>
+      </w:tr>
+      <w:tr>
+        <w:tc>
+          <w:tcPr>
+            <w:tcW w:w="1984" w:type="dxa"/>
+          </w:tcPr>
+          <w:p>
+            <w:pPr>
+              <w:pStyle w:val="Textoindependiente"/>
+              <w:jc w:val="center"/>
+              <w:rPr>
+                <w:i/>
+                <w:sz w:val="24"/>
+                <w:szCs w:val="24"/>
+              </w:rPr>
+            </w:pPr>
+            <w:r>
+              <w:rPr>
+                <w:i/>
+                <w:sz w:val="24"/>
+                <w:szCs w:val="24"/>
+              </w:rPr>
+              <w:t>64</w:t>
+            </w:r>
+          </w:p>
+        </w:tc>
+        <w:tc>
+          <w:tcPr>
+            <w:tcW w:w="3119" w:type="dxa"/>
+          </w:tcPr>
+          <w:p>
+            <w:pPr>
+              <w:pStyle w:val="Textoindependiente"/>
+              <w:jc w:val="center"/>
+              <w:rPr>
+                <w:sz w:val="24"/>
+                <w:szCs w:val="24"/>
+              </w:rPr>
+            </w:pPr>
+          </w:p>
+        </w:tc>
+      </w:tr>
+      <w:tr>
+        <w:tc>
+          <w:tcPr>
+            <w:tcW w:w="1984" w:type="dxa"/>
+          </w:tcPr>
+          <w:p>
+            <w:pPr>
+              <w:pStyle w:val="Textoindependiente"/>
+              <w:jc w:val="center"/>
+              <w:rPr>
+                <w:i/>
+                <w:sz w:val="24"/>
+                <w:szCs w:val="24"/>
+              </w:rPr>
+            </w:pPr>
+            <w:r>
+              <w:rPr>
+                <w:i/>
+                <w:sz w:val="24"/>
+                <w:szCs w:val="24"/>
+              </w:rPr>
+              <w:t>100</w:t>
+            </w:r>
+          </w:p>
+        </w:tc>
+        <w:tc>
+          <w:tcPr>
+            <w:tcW w:w="3119" w:type="dxa"/>
+          </w:tcPr>
+          <w:p>
+            <w:pPr>
+              <w:pStyle w:val="Textoindependiente"/>
+              <w:jc w:val="center"/>
+              <w:rPr>
+                <w:sz w:val="24"/>
+                <w:szCs w:val="24"/>
+              </w:rPr>
+            </w:pPr>
+          </w:p>
+        </w:tc>
+      </w:tr>
+      <w:tr>
+        <w:tc>
+          <w:tcPr>
+            <w:tcW w:w="1984" w:type="dxa"/>
+          </w:tcPr>
+          <w:p>
+            <w:pPr>
+              <w:pStyle w:val="Textoindependiente"/>
+              <w:jc w:val="center"/>
+              <w:rPr>
+                <w:i/>
+                <w:sz w:val="24"/>
+                <w:szCs w:val="24"/>
+              </w:rPr>
+            </w:pPr>
+            <w:r>
+              <w:rPr>
+                <w:i/>
+                <w:sz w:val="24"/>
+                <w:szCs w:val="24"/>
+              </w:rPr>
+              <w:t>128</w:t>
+            </w:r>
+          </w:p>
+        </w:tc>
+        <w:tc>
+          <w:tcPr>
+            <w:tcW w:w="3119" w:type="dxa"/>
+          </w:tcPr>
+          <w:p>
+            <w:pPr>
+              <w:pStyle w:val="Textoindependiente"/>
+              <w:jc w:val="center"/>
+              <w:rPr>
+                <w:sz w:val="24"/>
+                <w:szCs w:val="24"/>
+              </w:rPr>
+            </w:pPr>
+          </w:p>
+        </w:tc>
+      </w:tr>
+      <w:tr>
+        <w:tc>
+          <w:tcPr>
+            <w:tcW w:w="1984" w:type="dxa"/>
+          </w:tcPr>
+          <w:p>
+            <w:pPr>
+              <w:pStyle w:val="Textoindependiente"/>
+              <w:jc w:val="center"/>
+              <w:rPr>
+                <w:i/>
+                <w:sz w:val="24"/>
+                <w:szCs w:val="24"/>
+              </w:rPr>
+            </w:pPr>
+            <w:r>
+              <w:rPr>
+                <w:i/>
+                <w:sz w:val="24"/>
+                <w:szCs w:val="24"/>
+              </w:rPr>
+              <w:t>256</w:t>
+            </w:r>
+          </w:p>
+        </w:tc>
+        <w:tc>
+          <w:tcPr>
+            <w:tcW w:w="3119" w:type="dxa"/>
+          </w:tcPr>
+          <w:p>
+            <w:pPr>
+              <w:pStyle w:val="Textoindependiente"/>
+              <w:jc w:val="center"/>
+              <w:rPr>
+                <w:sz w:val="24"/>
+                <w:szCs w:val="24"/>
+              </w:rPr>
+            </w:pPr>
+          </w:p>
+        </w:tc>
+      </w:tr>
+      <w:tr>
+        <w:tc>
+          <w:tcPr>
+            <w:tcW w:w="1984" w:type="dxa"/>
+          </w:tcPr>
+          <w:p>
+            <w:pPr>
+              <w:pStyle w:val="Textoindependiente"/>
+              <w:jc w:val="center"/>
+              <w:rPr>
+                <w:i/>
+                <w:sz w:val="24"/>
+                <w:szCs w:val="24"/>
+              </w:rPr>
+            </w:pPr>
+            <w:r>
+              <w:rPr>
+                <w:i/>
+                <w:sz w:val="24"/>
+                <w:szCs w:val="24"/>
+              </w:rPr>
+              <w:t>512</w:t>
+            </w:r>
+          </w:p>
+        </w:tc>
+        <w:tc>
+          <w:tcPr>
+            <w:tcW w:w="3119" w:type="dxa"/>
+          </w:tcPr>
+          <w:p>
+            <w:pPr>
+              <w:pStyle w:val="Textoindependiente"/>
+              <w:jc w:val="center"/>
+              <w:rPr>
+                <w:sz w:val="24"/>
+                <w:szCs w:val="24"/>
+              </w:rPr>
+            </w:pPr>
+          </w:p>
+        </w:tc>
+      </w:tr>
+      <w:tr>
+        <w:tc>
+          <w:tcPr>
+            <w:tcW w:w="1984" w:type="dxa"/>
+          </w:tcPr>
+          <w:p>
+            <w:pPr>
+              <w:pStyle w:val="Textoindependiente"/>
+              <w:jc w:val="center"/>
+              <w:rPr>
+                <w:i/>
+                <w:sz w:val="24"/>
+                <w:szCs w:val="24"/>
+              </w:rPr>
+            </w:pPr>
+            <w:r>
+              <w:rPr>
+                <w:i/>
+                <w:sz w:val="24"/>
+                <w:szCs w:val="24"/>
+              </w:rPr>
+              <w:t>1024</w:t>
+            </w:r>
+          </w:p>
+        </w:tc>
+        <w:tc>
+          <w:tcPr>
+            <w:tcW w:w="3119" w:type="dxa"/>
+          </w:tcPr>
+          <w:p>
+            <w:pPr>
+              <w:pStyle w:val="Textoindependiente"/>
+              <w:jc w:val="center"/>
+              <w:rPr>
+                <w:sz w:val="24"/>
+                <w:szCs w:val="24"/>
+              </w:rPr>
+            </w:pPr>
+          </w:p>
+        </w:tc>
+      </w:tr>
+      <w:tr>
+        <w:tc>
+          <w:tcPr>
+            <w:tcW w:w="1984" w:type="dxa"/>
+          </w:tcPr>
+          <w:p>
+            <w:pPr>
+              <w:pStyle w:val="Textoindependiente"/>
+              <w:jc w:val="center"/>
+              <w:rPr>
+                <w:i/>
+                <w:sz w:val="24"/>
+                <w:szCs w:val="24"/>
+              </w:rPr>
+            </w:pPr>
+            <w:r>
+              <w:rPr>
+                <w:i/>
+                <w:sz w:val="24"/>
+                <w:szCs w:val="24"/>
+              </w:rPr>
+              <w:t>2048</w:t>
+            </w:r>
+          </w:p>
+        </w:tc>
+        <w:tc>
+          <w:tcPr>
+            <w:tcW w:w="3119" w:type="dxa"/>
+          </w:tcPr>
+          <w:p>
+            <w:pPr>
+              <w:pStyle w:val="Textoindependiente"/>
+              <w:jc w:val="center"/>
+              <w:rPr>
+                <w:sz w:val="24"/>
+                <w:szCs w:val="24"/>
+              </w:rPr>
+            </w:pPr>
+          </w:p>
+        </w:tc>
+      </w:tr>
+      <w:tr>
+        <w:tc>
+          <w:tcPr>
+            <w:tcW w:w="1984" w:type="dxa"/>
+          </w:tcPr>
+          <w:p>
+            <w:pPr>
+              <w:pStyle w:val="Textoindependiente"/>
+              <w:jc w:val="center"/>
+              <w:rPr>
+                <w:i/>
+                <w:sz w:val="24"/>
+                <w:szCs w:val="24"/>
+              </w:rPr>
+            </w:pPr>
+            <w:r>
+              <w:rPr>
+                <w:i/>
+                <w:sz w:val="24"/>
+                <w:szCs w:val="24"/>
+              </w:rPr>
+              <w:t>4096</w:t>
+            </w:r>
+          </w:p>
+        </w:tc>
+        <w:tc>
+          <w:tcPr>
+            <w:tcW w:w="3119" w:type="dxa"/>
+          </w:tcPr>
+          <w:p>
+            <w:pPr>
+              <w:pStyle w:val="Textoindependiente"/>
+              <w:jc w:val="center"/>
+              <w:rPr>
+                <w:sz w:val="24"/>
+                <w:szCs w:val="24"/>
+              </w:rPr>
+            </w:pPr>
+          </w:p>
+        </w:tc>
+      </w:tr>
+      <w:tr>
+        <w:tc>
+          <w:tcPr>
+            <w:tcW w:w="1984" w:type="dxa"/>
+          </w:tcPr>
+          <w:p>
+            <w:pPr>
+              <w:pStyle w:val="Textoindependiente"/>
+              <w:jc w:val="center"/>
+              <w:rPr>
+                <w:i/>
+                <w:sz w:val="24"/>
+                <w:szCs w:val="24"/>
+              </w:rPr>
+            </w:pPr>
+            <w:r>
+              <w:rPr>
+                <w:i/>
+                <w:sz w:val="24"/>
+                <w:szCs w:val="24"/>
+              </w:rPr>
+              <w:t>8192</w:t>
+            </w:r>
+          </w:p>
+        </w:tc>
+        <w:tc>
+          <w:tcPr>
+            <w:tcW w:w="3119" w:type="dxa"/>
+          </w:tcPr>
+          <w:p>
+            <w:pPr>
+              <w:pStyle w:val="Textoindependiente"/>
+              <w:jc w:val="center"/>
+              <w:rPr>
+                <w:sz w:val="24"/>
+                <w:szCs w:val="24"/>
+              </w:rPr>
+            </w:pPr>
+          </w:p>
+        </w:tc>
+      </w:tr>
+      <w:tr>
+        <w:tc>
+          <w:tcPr>
+            <w:tcW w:w="1984" w:type="dxa"/>
+          </w:tcPr>
+          <w:p>
+            <w:pPr>
+              <w:jc w:val="center"/>
+              <w:rPr>
+                <w:i/>
+                <w:sz w:val="24"/>
+              </w:rPr>
+            </w:pPr>
+            <w:r>
+              <w:rPr>
+                <w:i/>
+                <w:sz w:val="24"/>
+              </w:rPr>
+              <w:t>16384</w:t>
+            </w:r>
+          </w:p>
+        </w:tc>
+        <w:tc>
+          <w:tcPr>
+            <w:tcW w:w="3119" w:type="dxa"/>
+          </w:tcPr>
+          <w:p>
+            <w:pPr>
+              <w:pStyle w:val="Textoindependiente"/>
+              <w:jc w:val="center"/>
+              <w:rPr>
+                <w:sz w:val="24"/>
+                <w:szCs w:val="24"/>
+              </w:rPr>
+            </w:pPr>
+          </w:p>
+        </w:tc>
+      </w:tr>
+      <w:tr>
+        <w:tc>
+          <w:tcPr>
+            <w:tcW w:w="1984" w:type="dxa"/>
+          </w:tcPr>
+          <w:p>
+            <w:pPr>
+              <w:jc w:val="center"/>
+              <w:rPr>
+                <w:i/>
+                <w:sz w:val="24"/>
+              </w:rPr>
+            </w:pPr>
+            <w:r>
+              <w:rPr>
+                <w:i/>
+                <w:sz w:val="24"/>
+              </w:rPr>
+              <w:t>32768</w:t>
+            </w:r>
+          </w:p>
+        </w:tc>
+        <w:tc>
+          <w:tcPr>
+            <w:tcW w:w="3119" w:type="dxa"/>
+          </w:tcPr>
+          <w:p>
+            <w:pPr>
+              <w:pStyle w:val="Textoindependiente"/>
+              <w:jc w:val="center"/>
+              <w:rPr>
+                <w:sz w:val="24"/>
+                <w:szCs w:val="24"/>
+              </w:rPr>
+            </w:pPr>
+          </w:p>
+        </w:tc>
+      </w:tr>
+      <w:tr>
+        <w:tc>
+          <w:tcPr>
+            <w:tcW w:w="1984" w:type="dxa"/>
+          </w:tcPr>
+          <w:p>
+            <w:pPr>
+              <w:jc w:val="center"/>
+              <w:rPr>
+                <w:i/>
+                <w:sz w:val="24"/>
+              </w:rPr>
+            </w:pPr>
+            <w:r>
+              <w:rPr>
+                <w:i/>
+                <w:sz w:val="24"/>
+              </w:rPr>
+              <w:lastRenderedPageBreak/>
+              <w:t>65536</w:t>
+            </w:r>
+          </w:p>
+        </w:tc>
+        <w:tc>
+          <w:tcPr>
+            <w:tcW w:w="3119" w:type="dxa"/>
+          </w:tcPr>
+          <w:p>
+            <w:pPr>
+              <w:pStyle w:val="Textoindependiente"/>
+              <w:jc w:val="center"/>
+              <w:rPr>
+                <w:sz w:val="24"/>
+                <w:szCs w:val="24"/>
+              </w:rPr>
+            </w:pPr>
+          </w:p>
+        </w:tc>
+      </w:tr>
+    </w:tbl>
     <w:p>
       <w:pPr>
         <w:pStyle w:val="Textoindependiente"/>
         <w:rPr>
-          <w:b/>
           <w:sz w:val="24"/>
           <w:szCs w:val="24"/>
         </w:rPr>
@@ -20655,6 +21645,22 @@
           <w:sz w:val="24"/>
           <w:szCs w:val="24"/>
         </w:rPr>
+        <w:t>Implementar el módulo coloreado_grafo.py, de modo que podamos calcular una solución y visualizarla con el módulo proporcionado en Python.</w:t>
+      </w:r>
+      <w:r>
+        <w:rPr>
+          <w:b/>
+          <w:sz w:val="24"/>
+          <w:szCs w:val="24"/>
+        </w:rPr>
+        <w:t xml:space="preserve"> </w:t>
+      </w:r>
+      <w:r>
+        <w:rPr>
+          <w:b/>
+          <w:sz w:val="24"/>
+          <w:szCs w:val="24"/>
+        </w:rPr>
         <w:t>Razone convenientemente la complejidad temporal del algoritmo im</w:t>
       </w:r>
       <w:r>
@@ -20670,65 +21676,746 @@
       <w:pPr>
         <w:pStyle w:val="Textoindependiente"/>
         <w:rPr>
+          <w:szCs w:val="24"/>
+        </w:rPr>
+      </w:pPr>
+    </w:p>
+    <w:p>
+      <w:pPr>
+        <w:pStyle w:val="Textoindependiente"/>
+        <w:rPr>
+          <w:b/>
+          <w:sz w:val="24"/>
+          <w:szCs w:val="24"/>
+        </w:rPr>
+      </w:pPr>
+      <w:r>
+        <w:rPr>
+          <w:b/>
+          <w:sz w:val="24"/>
+          <w:szCs w:val="24"/>
+        </w:rPr>
+        <w:t xml:space="preserve">Implementar un módulo devorador_tiempos.py, que emplee los grafos contenidos en </w:t>
+      </w:r>
+      <w:proofErr w:type="spellStart"/>
+      <w:r>
+        <w:rPr>
+          <w:b/>
+          <w:sz w:val="24"/>
+          <w:szCs w:val="24"/>
+        </w:rPr>
+        <w:t>sols</w:t>
+      </w:r>
+      <w:proofErr w:type="spellEnd"/>
+      <w:r>
+        <w:rPr>
+          <w:b/>
+          <w:sz w:val="24"/>
+          <w:szCs w:val="24"/>
+        </w:rPr>
+        <w:t xml:space="preserve"> y calculando el tiempo que tarda el algoritmo hecho en el apartado anterior en resolver el problema, de forma que se pueda ir rellenando la siguiente tabla.</w:t>
+      </w:r>
+    </w:p>
+    <w:p>
+      <w:pPr>
+        <w:pStyle w:val="Textoindependiente"/>
+        <w:rPr>
+          <w:b/>
+          <w:sz w:val="24"/>
+          <w:szCs w:val="24"/>
+        </w:rPr>
+      </w:pPr>
+      <w:r>
+        <w:rPr>
+          <w:b/>
+          <w:sz w:val="24"/>
+          <w:szCs w:val="24"/>
+        </w:rPr>
+        <w:t>Razone: ¿siguen la complejidad calculada los tiempos de la tabla?</w:t>
+      </w:r>
+    </w:p>
+    <w:tbl>
+      <w:tblPr>
+        <w:tblStyle w:val="Tablaconcuadrcula"/>
+        <w:tblW w:w="0" w:type="auto"/>
+        <w:tblInd w:w="2263" w:type="dxa"/>
+        <w:tblLook w:val="04A0" w:firstRow="1" w:lastRow="0" w:firstColumn="1" w:lastColumn="0" w:noHBand="0" w:noVBand="1"/>
+      </w:tblPr>
+      <w:tblGrid>
+        <w:gridCol w:w="1984"/>
+        <w:gridCol w:w="3119"/>
+      </w:tblGrid>
+      <w:tr>
+        <w:tc>
+          <w:tcPr>
+            <w:tcW w:w="1984" w:type="dxa"/>
+          </w:tcPr>
+          <w:p>
+            <w:pPr>
+              <w:pStyle w:val="Textoindependiente"/>
+              <w:jc w:val="center"/>
+              <w:rPr>
+                <w:b/>
+                <w:sz w:val="24"/>
+                <w:szCs w:val="24"/>
+              </w:rPr>
+            </w:pPr>
+            <w:r>
+              <w:rPr>
+                <w:b/>
+                <w:sz w:val="24"/>
+                <w:szCs w:val="24"/>
+              </w:rPr>
+              <w:t>n</w:t>
+            </w:r>
+          </w:p>
+        </w:tc>
+        <w:tc>
+          <w:tcPr>
+            <w:tcW w:w="3119" w:type="dxa"/>
+          </w:tcPr>
+          <w:p>
+            <w:pPr>
+              <w:pStyle w:val="Textoindependiente"/>
+              <w:jc w:val="center"/>
+              <w:rPr>
+                <w:b/>
+                <w:sz w:val="24"/>
+                <w:szCs w:val="24"/>
+              </w:rPr>
+            </w:pPr>
+            <w:r>
+              <w:rPr>
+                <w:b/>
+                <w:sz w:val="24"/>
+                <w:szCs w:val="24"/>
+              </w:rPr>
+              <w:t>t Coloreado (ms)</w:t>
+            </w:r>
+          </w:p>
+        </w:tc>
+      </w:tr>
+      <w:tr>
+        <w:tc>
+          <w:tcPr>
+            <w:tcW w:w="1984" w:type="dxa"/>
+          </w:tcPr>
+          <w:p>
+            <w:pPr>
+              <w:pStyle w:val="Textoindependiente"/>
+              <w:jc w:val="center"/>
+              <w:rPr>
+                <w:i/>
+                <w:sz w:val="24"/>
+                <w:szCs w:val="24"/>
+              </w:rPr>
+            </w:pPr>
+            <w:r>
+              <w:rPr>
+                <w:i/>
+                <w:sz w:val="24"/>
+                <w:szCs w:val="24"/>
+              </w:rPr>
+              <w:t>4</w:t>
+            </w:r>
+          </w:p>
+        </w:tc>
+        <w:tc>
+          <w:tcPr>
+            <w:tcW w:w="3119" w:type="dxa"/>
+          </w:tcPr>
+          <w:p>
+            <w:pPr>
+              <w:pStyle w:val="Textoindependiente"/>
+              <w:jc w:val="center"/>
+              <w:rPr>
+                <w:sz w:val="24"/>
+                <w:szCs w:val="24"/>
+              </w:rPr>
+            </w:pPr>
+          </w:p>
+        </w:tc>
+      </w:tr>
+      <w:tr>
+        <w:tc>
+          <w:tcPr>
+            <w:tcW w:w="1984" w:type="dxa"/>
+          </w:tcPr>
+          <w:p>
+            <w:pPr>
+              <w:pStyle w:val="Textoindependiente"/>
+              <w:jc w:val="center"/>
+              <w:rPr>
+                <w:i/>
+                <w:sz w:val="24"/>
+                <w:szCs w:val="24"/>
+              </w:rPr>
+            </w:pPr>
+            <w:r>
+              <w:rPr>
+                <w:i/>
+                <w:sz w:val="24"/>
+                <w:szCs w:val="24"/>
+              </w:rPr>
+              <w:t>8</w:t>
+            </w:r>
+          </w:p>
+        </w:tc>
+        <w:tc>
+          <w:tcPr>
+            <w:tcW w:w="3119" w:type="dxa"/>
+          </w:tcPr>
+          <w:p>
+            <w:pPr>
+              <w:pStyle w:val="Textoindependiente"/>
+              <w:jc w:val="center"/>
+              <w:rPr>
+                <w:sz w:val="24"/>
+                <w:szCs w:val="24"/>
+              </w:rPr>
+            </w:pPr>
+          </w:p>
+        </w:tc>
+      </w:tr>
+      <w:tr>
+        <w:tc>
+          <w:tcPr>
+            <w:tcW w:w="1984" w:type="dxa"/>
+          </w:tcPr>
+          <w:p>
+            <w:pPr>
+              <w:pStyle w:val="Textoindependiente"/>
+              <w:jc w:val="center"/>
+              <w:rPr>
+                <w:i/>
+                <w:sz w:val="24"/>
+                <w:szCs w:val="24"/>
+              </w:rPr>
+            </w:pPr>
+            <w:r>
+              <w:rPr>
+                <w:i/>
+                <w:sz w:val="24"/>
+                <w:szCs w:val="24"/>
+              </w:rPr>
+              <w:t>16</w:t>
+            </w:r>
+          </w:p>
+        </w:tc>
+        <w:tc>
+          <w:tcPr>
+            <w:tcW w:w="3119" w:type="dxa"/>
+          </w:tcPr>
+          <w:p>
+            <w:pPr>
+              <w:pStyle w:val="Textoindependiente"/>
+              <w:jc w:val="center"/>
+              <w:rPr>
+                <w:sz w:val="24"/>
+                <w:szCs w:val="24"/>
+              </w:rPr>
+            </w:pPr>
+          </w:p>
+        </w:tc>
+      </w:tr>
+      <w:tr>
+        <w:tc>
+          <w:tcPr>
+            <w:tcW w:w="1984" w:type="dxa"/>
+          </w:tcPr>
+          <w:p>
+            <w:pPr>
+              <w:pStyle w:val="Textoindependiente"/>
+              <w:jc w:val="center"/>
+              <w:rPr>
+                <w:i/>
+                <w:sz w:val="24"/>
+                <w:szCs w:val="24"/>
+              </w:rPr>
+            </w:pPr>
+            <w:r>
+              <w:rPr>
+                <w:i/>
+                <w:sz w:val="24"/>
+                <w:szCs w:val="24"/>
+              </w:rPr>
+              <w:t>32</w:t>
+            </w:r>
+          </w:p>
+        </w:tc>
+        <w:tc>
+          <w:tcPr>
+            <w:tcW w:w="3119" w:type="dxa"/>
+          </w:tcPr>
+          <w:p>
+            <w:pPr>
+              <w:pStyle w:val="Textoindependiente"/>
+              <w:jc w:val="center"/>
+              <w:rPr>
+                <w:sz w:val="24"/>
+                <w:szCs w:val="24"/>
+              </w:rPr>
+            </w:pPr>
+          </w:p>
+        </w:tc>
+      </w:tr>
+      <w:tr>
+        <w:tc>
+          <w:tcPr>
+            <w:tcW w:w="1984" w:type="dxa"/>
+          </w:tcPr>
+          <w:p>
+            <w:pPr>
+              <w:pStyle w:val="Textoindependiente"/>
+              <w:jc w:val="center"/>
+              <w:rPr>
+                <w:i/>
+                <w:sz w:val="24"/>
+                <w:szCs w:val="24"/>
+              </w:rPr>
+            </w:pPr>
+            <w:r>
+              <w:rPr>
+                <w:i/>
+                <w:sz w:val="24"/>
+                <w:szCs w:val="24"/>
+              </w:rPr>
+              <w:t>64</w:t>
+            </w:r>
+          </w:p>
+        </w:tc>
+        <w:tc>
+          <w:tcPr>
+            <w:tcW w:w="3119" w:type="dxa"/>
+          </w:tcPr>
+          <w:p>
+            <w:pPr>
+              <w:pStyle w:val="Textoindependiente"/>
+              <w:jc w:val="center"/>
+              <w:rPr>
+                <w:sz w:val="24"/>
+                <w:szCs w:val="24"/>
+              </w:rPr>
+            </w:pPr>
+          </w:p>
+        </w:tc>
+      </w:tr>
+      <w:tr>
+        <w:tc>
+          <w:tcPr>
+            <w:tcW w:w="1984" w:type="dxa"/>
+          </w:tcPr>
+          <w:p>
+            <w:pPr>
+              <w:pStyle w:val="Textoindependiente"/>
+              <w:jc w:val="center"/>
+              <w:rPr>
+                <w:i/>
+                <w:sz w:val="24"/>
+                <w:szCs w:val="24"/>
+              </w:rPr>
+            </w:pPr>
+            <w:r>
+              <w:rPr>
+                <w:i/>
+                <w:sz w:val="24"/>
+                <w:szCs w:val="24"/>
+              </w:rPr>
+              <w:t>100</w:t>
+            </w:r>
+          </w:p>
+        </w:tc>
+        <w:tc>
+          <w:tcPr>
+            <w:tcW w:w="3119" w:type="dxa"/>
+          </w:tcPr>
+          <w:p>
+            <w:pPr>
+              <w:pStyle w:val="Textoindependiente"/>
+              <w:jc w:val="center"/>
+              <w:rPr>
+                <w:sz w:val="24"/>
+                <w:szCs w:val="24"/>
+              </w:rPr>
+            </w:pPr>
+          </w:p>
+        </w:tc>
+      </w:tr>
+      <w:tr>
+        <w:tc>
+          <w:tcPr>
+            <w:tcW w:w="1984" w:type="dxa"/>
+          </w:tcPr>
+          <w:p>
+            <w:pPr>
+              <w:pStyle w:val="Textoindependiente"/>
+              <w:jc w:val="center"/>
+              <w:rPr>
+                <w:i/>
+                <w:sz w:val="24"/>
+                <w:szCs w:val="24"/>
+              </w:rPr>
+            </w:pPr>
+            <w:r>
+              <w:rPr>
+                <w:i/>
+                <w:sz w:val="24"/>
+                <w:szCs w:val="24"/>
+              </w:rPr>
+              <w:t>128</w:t>
+            </w:r>
+          </w:p>
+        </w:tc>
+        <w:tc>
+          <w:tcPr>
+            <w:tcW w:w="3119" w:type="dxa"/>
+          </w:tcPr>
+          <w:p>
+            <w:pPr>
+              <w:pStyle w:val="Textoindependiente"/>
+              <w:jc w:val="center"/>
+              <w:rPr>
+                <w:sz w:val="24"/>
+                <w:szCs w:val="24"/>
+              </w:rPr>
+            </w:pPr>
+          </w:p>
+        </w:tc>
+      </w:tr>
+      <w:tr>
+        <w:tc>
+          <w:tcPr>
+            <w:tcW w:w="1984" w:type="dxa"/>
+          </w:tcPr>
+          <w:p>
+            <w:pPr>
+              <w:pStyle w:val="Textoindependiente"/>
+              <w:jc w:val="center"/>
+              <w:rPr>
+                <w:i/>
+                <w:sz w:val="24"/>
+                <w:szCs w:val="24"/>
+              </w:rPr>
+            </w:pPr>
+            <w:r>
+              <w:rPr>
+                <w:i/>
+                <w:sz w:val="24"/>
+                <w:szCs w:val="24"/>
+              </w:rPr>
+              <w:t>256</w:t>
+            </w:r>
+          </w:p>
+        </w:tc>
+        <w:tc>
+          <w:tcPr>
+            <w:tcW w:w="3119" w:type="dxa"/>
+          </w:tcPr>
+          <w:p>
+            <w:pPr>
+              <w:pStyle w:val="Textoindependiente"/>
+              <w:jc w:val="center"/>
+              <w:rPr>
+                <w:sz w:val="24"/>
+                <w:szCs w:val="24"/>
+              </w:rPr>
+            </w:pPr>
+          </w:p>
+        </w:tc>
+      </w:tr>
+      <w:tr>
+        <w:tc>
+          <w:tcPr>
+            <w:tcW w:w="1984" w:type="dxa"/>
+          </w:tcPr>
+          <w:p>
+            <w:pPr>
+              <w:pStyle w:val="Textoindependiente"/>
+              <w:jc w:val="center"/>
+              <w:rPr>
+                <w:i/>
+                <w:sz w:val="24"/>
+                <w:szCs w:val="24"/>
+              </w:rPr>
+            </w:pPr>
+            <w:r>
+              <w:rPr>
+                <w:i/>
+                <w:sz w:val="24"/>
+                <w:szCs w:val="24"/>
+              </w:rPr>
+              <w:t>512</w:t>
+            </w:r>
+          </w:p>
+        </w:tc>
+        <w:tc>
+          <w:tcPr>
+            <w:tcW w:w="3119" w:type="dxa"/>
+          </w:tcPr>
+          <w:p>
+            <w:pPr>
+              <w:pStyle w:val="Textoindependiente"/>
+              <w:jc w:val="center"/>
+              <w:rPr>
+                <w:sz w:val="24"/>
+                <w:szCs w:val="24"/>
+              </w:rPr>
+            </w:pPr>
+          </w:p>
+        </w:tc>
+      </w:tr>
+      <w:tr>
+        <w:tc>
+          <w:tcPr>
+            <w:tcW w:w="1984" w:type="dxa"/>
+          </w:tcPr>
+          <w:p>
+            <w:pPr>
+              <w:pStyle w:val="Textoindependiente"/>
+              <w:jc w:val="center"/>
+              <w:rPr>
+                <w:i/>
+                <w:sz w:val="24"/>
+                <w:szCs w:val="24"/>
+              </w:rPr>
+            </w:pPr>
+            <w:r>
+              <w:rPr>
+                <w:i/>
+                <w:sz w:val="24"/>
+                <w:szCs w:val="24"/>
+              </w:rPr>
+              <w:t>1024</w:t>
+            </w:r>
+          </w:p>
+        </w:tc>
+        <w:tc>
+          <w:tcPr>
+            <w:tcW w:w="3119" w:type="dxa"/>
+          </w:tcPr>
+          <w:p>
+            <w:pPr>
+              <w:pStyle w:val="Textoindependiente"/>
+              <w:jc w:val="center"/>
+              <w:rPr>
+                <w:sz w:val="24"/>
+                <w:szCs w:val="24"/>
+              </w:rPr>
+            </w:pPr>
+          </w:p>
+        </w:tc>
+      </w:tr>
+      <w:tr>
+        <w:tc>
+          <w:tcPr>
+            <w:tcW w:w="1984" w:type="dxa"/>
+          </w:tcPr>
+          <w:p>
+            <w:pPr>
+              <w:pStyle w:val="Textoindependiente"/>
+              <w:jc w:val="center"/>
+              <w:rPr>
+                <w:i/>
+                <w:sz w:val="24"/>
+                <w:szCs w:val="24"/>
+              </w:rPr>
+            </w:pPr>
+            <w:r>
+              <w:rPr>
+                <w:i/>
+                <w:sz w:val="24"/>
+                <w:szCs w:val="24"/>
+              </w:rPr>
+              <w:t>2048</w:t>
+            </w:r>
+          </w:p>
+        </w:tc>
+        <w:tc>
+          <w:tcPr>
+            <w:tcW w:w="3119" w:type="dxa"/>
+          </w:tcPr>
+          <w:p>
+            <w:pPr>
+              <w:pStyle w:val="Textoindependiente"/>
+              <w:jc w:val="center"/>
+              <w:rPr>
+                <w:sz w:val="24"/>
+                <w:szCs w:val="24"/>
+              </w:rPr>
+            </w:pPr>
+          </w:p>
+        </w:tc>
+      </w:tr>
+      <w:tr>
+        <w:tc>
+          <w:tcPr>
+            <w:tcW w:w="1984" w:type="dxa"/>
+          </w:tcPr>
+          <w:p>
+            <w:pPr>
+              <w:pStyle w:val="Textoindependiente"/>
+              <w:jc w:val="center"/>
+              <w:rPr>
+                <w:i/>
+                <w:sz w:val="24"/>
+                <w:szCs w:val="24"/>
+              </w:rPr>
+            </w:pPr>
+            <w:r>
+              <w:rPr>
+                <w:i/>
+                <w:sz w:val="24"/>
+                <w:szCs w:val="24"/>
+              </w:rPr>
+              <w:t>4096</w:t>
+            </w:r>
+          </w:p>
+        </w:tc>
+        <w:tc>
+          <w:tcPr>
+            <w:tcW w:w="3119" w:type="dxa"/>
+          </w:tcPr>
+          <w:p>
+            <w:pPr>
+              <w:pStyle w:val="Textoindependiente"/>
+              <w:jc w:val="center"/>
+              <w:rPr>
+                <w:sz w:val="24"/>
+                <w:szCs w:val="24"/>
+              </w:rPr>
+            </w:pPr>
+          </w:p>
+        </w:tc>
+      </w:tr>
+      <w:tr>
+        <w:tc>
+          <w:tcPr>
+            <w:tcW w:w="1984" w:type="dxa"/>
+          </w:tcPr>
+          <w:p>
+            <w:pPr>
+              <w:pStyle w:val="Textoindependiente"/>
+              <w:jc w:val="center"/>
+              <w:rPr>
+                <w:i/>
+                <w:sz w:val="24"/>
+                <w:szCs w:val="24"/>
+              </w:rPr>
+            </w:pPr>
+            <w:r>
+              <w:rPr>
+                <w:i/>
+                <w:sz w:val="24"/>
+                <w:szCs w:val="24"/>
+              </w:rPr>
+              <w:t>8192</w:t>
+            </w:r>
+          </w:p>
+        </w:tc>
+        <w:tc>
+          <w:tcPr>
+            <w:tcW w:w="3119" w:type="dxa"/>
+          </w:tcPr>
+          <w:p>
+            <w:pPr>
+              <w:pStyle w:val="Textoindependiente"/>
+              <w:jc w:val="center"/>
+              <w:rPr>
+                <w:sz w:val="24"/>
+                <w:szCs w:val="24"/>
+              </w:rPr>
+            </w:pPr>
+          </w:p>
+        </w:tc>
+      </w:tr>
+      <w:tr>
+        <w:tc>
+          <w:tcPr>
+            <w:tcW w:w="1984" w:type="dxa"/>
+          </w:tcPr>
+          <w:p>
+            <w:pPr>
+              <w:jc w:val="center"/>
+              <w:rPr>
+                <w:i/>
+                <w:sz w:val="24"/>
+              </w:rPr>
+            </w:pPr>
+            <w:r>
+              <w:rPr>
+                <w:i/>
+                <w:sz w:val="24"/>
+              </w:rPr>
+              <w:t>16384</w:t>
+            </w:r>
+          </w:p>
+        </w:tc>
+        <w:tc>
+          <w:tcPr>
+            <w:tcW w:w="3119" w:type="dxa"/>
+          </w:tcPr>
+          <w:p>
+            <w:pPr>
+              <w:pStyle w:val="Textoindependiente"/>
+              <w:jc w:val="center"/>
+              <w:rPr>
+                <w:sz w:val="24"/>
+                <w:szCs w:val="24"/>
+              </w:rPr>
+            </w:pPr>
+          </w:p>
+        </w:tc>
+      </w:tr>
+      <w:tr>
+        <w:tc>
+          <w:tcPr>
+            <w:tcW w:w="1984" w:type="dxa"/>
+          </w:tcPr>
+          <w:p>
+            <w:pPr>
+              <w:jc w:val="center"/>
+              <w:rPr>
+                <w:i/>
+                <w:sz w:val="24"/>
+              </w:rPr>
+            </w:pPr>
+            <w:r>
+              <w:rPr>
+                <w:i/>
+                <w:sz w:val="24"/>
+              </w:rPr>
+              <w:t>32768</w:t>
+            </w:r>
+          </w:p>
+        </w:tc>
+        <w:tc>
+          <w:tcPr>
+            <w:tcW w:w="3119" w:type="dxa"/>
+          </w:tcPr>
+          <w:p>
+            <w:pPr>
+              <w:pStyle w:val="Textoindependiente"/>
+              <w:jc w:val="center"/>
+              <w:rPr>
+                <w:sz w:val="24"/>
+                <w:szCs w:val="24"/>
+              </w:rPr>
+            </w:pPr>
+          </w:p>
+        </w:tc>
+      </w:tr>
+    </w:tbl>
+    <w:p>
+      <w:pPr>
+        <w:pStyle w:val="Textoindependiente"/>
+        <w:rPr>
+          <w:b/>
+          <w:sz w:val="24"/>
           <w:szCs w:val="24"/>
         </w:rPr>
       </w:pPr>
       <w:bookmarkStart w:id="0" w:name="_GoBack"/>
       <w:bookmarkEnd w:id="0"/>
-    </w:p>
-    <w:p>
-      <w:pPr>
-        <w:pStyle w:val="Textoindependiente"/>
-        <w:rPr>
-          <w:b/>
-          <w:sz w:val="24"/>
-          <w:szCs w:val="24"/>
-        </w:rPr>
-      </w:pPr>
-      <w:r>
-        <w:rPr>
-          <w:b/>
-          <w:sz w:val="24"/>
-          <w:szCs w:val="24"/>
-        </w:rPr>
-        <w:t xml:space="preserve">Implementar un módulo devorador_tiempos.py, que emplee los grafos contenidos en </w:t>
-      </w:r>
-      <w:proofErr w:type="spellStart"/>
-      <w:r>
-        <w:rPr>
-          <w:b/>
-          <w:sz w:val="24"/>
-          <w:szCs w:val="24"/>
-        </w:rPr>
-        <w:t>sols</w:t>
-      </w:r>
-      <w:proofErr w:type="spellEnd"/>
-      <w:r>
-        <w:rPr>
-          <w:b/>
-          <w:sz w:val="24"/>
-          <w:szCs w:val="24"/>
-        </w:rPr>
-        <w:t xml:space="preserve"> y calculando el tiempo que tarda el algoritmo hecho en el apartado anterior en resolver el problema, de forma que se pueda ir rellenando la siguiente tabla.</w:t>
-      </w:r>
-    </w:p>
-    <w:p>
-      <w:pPr>
-        <w:pStyle w:val="Textoindependiente"/>
-        <w:rPr>
-          <w:b/>
-          <w:sz w:val="24"/>
-          <w:szCs w:val="24"/>
-        </w:rPr>
-      </w:pPr>
-      <w:r>
-        <w:rPr>
-          <w:b/>
-          <w:sz w:val="24"/>
-          <w:szCs w:val="24"/>
-        </w:rPr>
-        <w:t>Razone: ¿siguen la complejidad calculada los tiempos de la tabla?</w:t>
-      </w:r>
     </w:p>
     <w:sectPr>
       <w:pgSz w:w="11906" w:h="16838"/>
@@ -21133,7 +22820,7 @@
   <w:style w:type="paragraph" w:default="1" w:styleId="Normal">
     <w:name w:val="Normal"/>
     <w:qFormat/>
-    <w:rsid w:val="00ED5107"/>
+    <w:rsid w:val="00ED0F3C"/>
   </w:style>
   <w:style w:type="paragraph" w:styleId="Ttulo1">
     <w:name w:val="heading 1"/>
@@ -21352,6 +23039,22 @@
     <w:link w:val="Textoindependienteprimerasangra2"/>
     <w:uiPriority w:val="99"/>
     <w:rsid w:val="00183700"/>
+  </w:style>
+  <w:style w:type="paragraph" w:customStyle="1" w:styleId="Default">
+    <w:name w:val="Default"/>
+    <w:rsid w:val="0052461B"/>
+    <w:pPr>
+      <w:autoSpaceDE w:val="0"/>
+      <w:autoSpaceDN w:val="0"/>
+      <w:adjustRightInd w:val="0"/>
+      <w:spacing w:after="0" w:line="240" w:lineRule="auto"/>
+    </w:pPr>
+    <w:rPr>
+      <w:rFonts w:ascii="Times New Roman" w:hAnsi="Times New Roman" w:cs="Times New Roman"/>
+      <w:color w:val="000000"/>
+      <w:sz w:val="24"/>
+      <w:szCs w:val="24"/>
+    </w:rPr>
   </w:style>
 </w:styles>
 </file>
@@ -21622,7 +23325,7 @@
 </file>
 
 <file path=customXml/itemProps1.xml><?xml version="1.0" encoding="utf-8"?>
-<ds:datastoreItem xmlns:ds="http://schemas.openxmlformats.org/officeDocument/2006/customXml" ds:itemID="{45B25F9E-7FCF-4F58-A14F-1F3F0CC7205F}">
+<ds:datastoreItem xmlns:ds="http://schemas.openxmlformats.org/officeDocument/2006/customXml" ds:itemID="{3B472B19-D520-4D18-A2FD-F6C549D8CB2A}">
   <ds:schemaRefs>
     <ds:schemaRef ds:uri="http://schemas.openxmlformats.org/officeDocument/2006/bibliography"/>
   </ds:schemaRefs>

</xml_diff>

<commit_message>
Devorador tiempos con repeticiones.
</commit_message>
<xml_diff>
--- a/p4/P4.docx
+++ b/p4/P4.docx
@@ -20601,23 +20601,66 @@
         </w:rPr>
         <w:t xml:space="preserve"> </w:t>
       </w:r>
-      <w:proofErr w:type="gramStart"/>
       <w:r>
         <w:rPr>
           <w:b/>
           <w:sz w:val="24"/>
           <w:szCs w:val="24"/>
         </w:rPr>
-        <w:t>Razone</w:t>
-      </w:r>
-      <w:proofErr w:type="gramEnd"/>
-      <w:r>
-        <w:rPr>
-          <w:b/>
+        <w:t>Razone convenientemente la complejidad temporal del algoritmo implementado.</w:t>
+      </w:r>
+    </w:p>
+    <w:p>
+      <w:pPr>
+        <w:pStyle w:val="Textoindependiente"/>
+        <w:rPr>
           <w:sz w:val="24"/>
           <w:szCs w:val="24"/>
         </w:rPr>
-        <w:t xml:space="preserve"> convenientemente la complejidad temporal del algoritmo implementado.</w:t>
+      </w:pPr>
+      <w:r>
+        <w:rPr>
+          <w:sz w:val="24"/>
+          <w:szCs w:val="24"/>
+        </w:rPr>
+        <w:t xml:space="preserve">El algoritmo recorre todos los nodos del grafo </w:t>
+      </w:r>
+      <w:r>
+        <w:rPr>
+          <w:sz w:val="24"/>
+          <w:szCs w:val="24"/>
+        </w:rPr>
+        <w:t>y para</w:t>
+      </w:r>
+      <w:r>
+        <w:rPr>
+          <w:sz w:val="24"/>
+          <w:szCs w:val="24"/>
+        </w:rPr>
+        <w:t xml:space="preserve"> cada nodo se recorren sus vecinos utilizando la lista de ad</w:t>
+      </w:r>
+      <w:r>
+        <w:rPr>
+          <w:sz w:val="24"/>
+          <w:szCs w:val="24"/>
+        </w:rPr>
+        <w:t xml:space="preserve">yacencia del </w:t>
+      </w:r>
+      <w:proofErr w:type="spellStart"/>
+      <w:r>
+        <w:rPr>
+          <w:sz w:val="24"/>
+          <w:szCs w:val="24"/>
+        </w:rPr>
+        <w:t>map</w:t>
+      </w:r>
+      <w:proofErr w:type="spellEnd"/>
+      <w:r>
+        <w:rPr>
+          <w:sz w:val="24"/>
+          <w:szCs w:val="24"/>
+        </w:rPr>
+        <w:t>.</w:t>
       </w:r>
     </w:p>
     <w:p>
@@ -20633,28 +20676,98 @@
           <w:sz w:val="24"/>
           <w:szCs w:val="24"/>
         </w:rPr>
-        <w:t xml:space="preserve">El algoritmo recorre todos los nodos del grafo </w:t>
+        <w:t>Si n es el número de nodos y A</w:t>
       </w:r>
       <w:r>
         <w:rPr>
           <w:sz w:val="24"/>
           <w:szCs w:val="24"/>
         </w:rPr>
-        <w:t>y para</w:t>
+        <w:t xml:space="preserve"> el número de aristas</w:t>
       </w:r>
       <w:r>
         <w:rPr>
           <w:sz w:val="24"/>
           <w:szCs w:val="24"/>
         </w:rPr>
-        <w:t xml:space="preserve"> cada nodo se recorren sus vecinos utilizando la lista de ad</w:t>
+        <w:t>, recorrer todos los nodos</w:t>
       </w:r>
       <w:r>
         <w:rPr>
           <w:sz w:val="24"/>
           <w:szCs w:val="24"/>
         </w:rPr>
-        <w:t xml:space="preserve">yacencia del </w:t>
+        <w:t xml:space="preserve"> tiene co</w:t>
+      </w:r>
+      <w:r>
+        <w:rPr>
+          <w:sz w:val="24"/>
+          <w:szCs w:val="24"/>
+        </w:rPr>
+        <w:t xml:space="preserve">ste </w:t>
+      </w:r>
+      <w:r>
+        <w:rPr>
+          <w:sz w:val="24"/>
+          <w:szCs w:val="24"/>
+        </w:rPr>
+        <w:t xml:space="preserve">O(n), mientras que </w:t>
+      </w:r>
+      <w:r>
+        <w:rPr>
+          <w:sz w:val="24"/>
+          <w:szCs w:val="24"/>
+        </w:rPr>
+        <w:t>recorrer</w:t>
+      </w:r>
+      <w:r>
+        <w:rPr>
+          <w:sz w:val="24"/>
+          <w:szCs w:val="24"/>
+        </w:rPr>
+        <w:t xml:space="preserve"> los vecinos de cada nodo equivale a </w:t>
+      </w:r>
+      <w:r>
+        <w:rPr>
+          <w:sz w:val="24"/>
+          <w:szCs w:val="24"/>
+        </w:rPr>
+        <w:t xml:space="preserve">recorrer las aristas del </w:t>
+      </w:r>
+      <w:r>
+        <w:rPr>
+          <w:sz w:val="24"/>
+          <w:szCs w:val="24"/>
+        </w:rPr>
+        <w:t>nodo</w:t>
+      </w:r>
+      <w:r>
+        <w:rPr>
+          <w:sz w:val="24"/>
+          <w:szCs w:val="24"/>
+        </w:rPr>
+        <w:t xml:space="preserve"> (de cada arista sale un nodo</w:t>
+      </w:r>
+      <w:r>
+        <w:rPr>
+          <w:sz w:val="24"/>
+          <w:szCs w:val="24"/>
+        </w:rPr>
+        <w:t xml:space="preserve"> vecino), p</w:t>
+      </w:r>
+      <w:r>
+        <w:rPr>
+          <w:sz w:val="24"/>
+          <w:szCs w:val="24"/>
+        </w:rPr>
+        <w:t>or tanto, la comp</w:t>
+      </w:r>
+      <w:r>
+        <w:rPr>
+          <w:sz w:val="24"/>
+          <w:szCs w:val="24"/>
+        </w:rPr>
+        <w:t>lejidad total del algoritmo es O(</w:t>
       </w:r>
       <w:proofErr w:type="spellStart"/>
       <w:r>
@@ -20662,7 +20775,7 @@
           <w:sz w:val="24"/>
           <w:szCs w:val="24"/>
         </w:rPr>
-        <w:t>map</w:t>
+        <w:t>n+A</w:t>
       </w:r>
       <w:proofErr w:type="spellEnd"/>
       <w:r>
@@ -20670,7 +20783,7 @@
           <w:sz w:val="24"/>
           <w:szCs w:val="24"/>
         </w:rPr>
-        <w:t>.</w:t>
+        <w:t>)</w:t>
       </w:r>
     </w:p>
     <w:p>
@@ -20686,146 +20799,44 @@
           <w:sz w:val="24"/>
           <w:szCs w:val="24"/>
         </w:rPr>
-        <w:t>Si n es el número de nodos y A</w:t>
+        <w:t>En grafos dispersos, es decir, con pocas aristas (donde A</w:t>
       </w:r>
       <w:r>
         <w:rPr>
           <w:sz w:val="24"/>
           <w:szCs w:val="24"/>
         </w:rPr>
-        <w:t xml:space="preserve"> el número de aristas</w:t>
+        <w:t xml:space="preserve"> </w:t>
       </w:r>
       <w:r>
         <w:rPr>
           <w:sz w:val="24"/>
           <w:szCs w:val="24"/>
         </w:rPr>
-        <w:t>, recorrer todos los nodos</w:t>
+        <w:t xml:space="preserve">se aproxima a </w:t>
       </w:r>
       <w:r>
         <w:rPr>
           <w:sz w:val="24"/>
           <w:szCs w:val="24"/>
         </w:rPr>
-        <w:t xml:space="preserve"> tiene co</w:t>
+        <w:t xml:space="preserve">n) el coste es aproximadamente lineal, mientras que en grafos densos (donde </w:t>
       </w:r>
       <w:r>
         <w:rPr>
           <w:sz w:val="24"/>
           <w:szCs w:val="24"/>
         </w:rPr>
-        <w:t xml:space="preserve">ste </w:t>
-      </w:r>
+        <w:t>A</w:t>
+      </w:r>
+      <w:bookmarkStart w:id="0" w:name="_GoBack"/>
+      <w:bookmarkEnd w:id="0"/>
       <w:r>
         <w:rPr>
           <w:sz w:val="24"/>
           <w:szCs w:val="24"/>
         </w:rPr>
-        <w:t xml:space="preserve">O(n), mientras que </w:t>
-      </w:r>
-      <w:r>
-        <w:rPr>
-          <w:sz w:val="24"/>
-          <w:szCs w:val="24"/>
-        </w:rPr>
-        <w:t>recorrer</w:t>
-      </w:r>
-      <w:r>
-        <w:rPr>
-          <w:sz w:val="24"/>
-          <w:szCs w:val="24"/>
-        </w:rPr>
-        <w:t xml:space="preserve"> todos los vecinos de cada nodo equivale a </w:t>
-      </w:r>
-      <w:r>
-        <w:rPr>
-          <w:sz w:val="24"/>
-          <w:szCs w:val="24"/>
-        </w:rPr>
-        <w:t>recorrer las aristas del grafo (de cada arista sale un nodo).</w:t>
-      </w:r>
-    </w:p>
-    <w:p>
-      <w:pPr>
-        <w:pStyle w:val="Textoindependiente"/>
-        <w:rPr>
-          <w:sz w:val="24"/>
-          <w:szCs w:val="24"/>
-        </w:rPr>
-      </w:pPr>
-      <w:r>
-        <w:rPr>
-          <w:sz w:val="24"/>
-          <w:szCs w:val="24"/>
-        </w:rPr>
-        <w:t>Por tanto, la comp</w:t>
-      </w:r>
-      <w:r>
-        <w:rPr>
-          <w:sz w:val="24"/>
-          <w:szCs w:val="24"/>
-        </w:rPr>
-        <w:t>lejidad total del algoritmo es O(</w:t>
-      </w:r>
-      <w:proofErr w:type="spellStart"/>
-      <w:r>
-        <w:rPr>
-          <w:sz w:val="24"/>
-          <w:szCs w:val="24"/>
-        </w:rPr>
-        <w:t>n+A</w:t>
-      </w:r>
-      <w:proofErr w:type="spellEnd"/>
-      <w:r>
-        <w:rPr>
-          <w:sz w:val="24"/>
-          <w:szCs w:val="24"/>
-        </w:rPr>
-        <w:t>)</w:t>
-      </w:r>
-    </w:p>
-    <w:p>
-      <w:pPr>
-        <w:pStyle w:val="Textoindependiente"/>
-        <w:rPr>
-          <w:sz w:val="24"/>
-          <w:szCs w:val="24"/>
-        </w:rPr>
-      </w:pPr>
-      <w:r>
-        <w:rPr>
-          <w:sz w:val="24"/>
-          <w:szCs w:val="24"/>
-        </w:rPr>
-        <w:t>En grafos dispersos, es decir, con pocas aristas (donde A</w:t>
-      </w:r>
-      <w:r>
-        <w:rPr>
-          <w:sz w:val="24"/>
-          <w:szCs w:val="24"/>
-        </w:rPr>
-        <w:t xml:space="preserve"> </w:t>
-      </w:r>
-      <w:r>
-        <w:rPr>
-          <w:sz w:val="24"/>
-          <w:szCs w:val="24"/>
-        </w:rPr>
-        <w:t xml:space="preserve">se aproxima a </w:t>
-      </w:r>
-      <w:r>
-        <w:rPr>
-          <w:sz w:val="24"/>
-          <w:szCs w:val="24"/>
-        </w:rPr>
-        <w:t xml:space="preserve">n) el coste es aproximadamente lineal, mientras que en grafos densos (donde </w:t>
-      </w:r>
-      <w:r>
-        <w:rPr>
-          <w:sz w:val="24"/>
-          <w:szCs w:val="24"/>
-        </w:rPr>
-        <w:t>E es más o menos n</w:t>
+        <w:t xml:space="preserve"> es más o menos n</w:t>
       </w:r>
       <w:r>
         <w:rPr>
@@ -21010,6 +21021,13 @@
                 <w:szCs w:val="24"/>
               </w:rPr>
             </w:pPr>
+            <w:r>
+              <w:rPr>
+                <w:sz w:val="24"/>
+                <w:szCs w:val="24"/>
+              </w:rPr>
+              <w:t>6</w:t>
+            </w:r>
           </w:p>
         </w:tc>
       </w:tr>
@@ -21051,6 +21069,13 @@
                 <w:szCs w:val="24"/>
               </w:rPr>
             </w:pPr>
+            <w:r>
+              <w:rPr>
+                <w:sz w:val="24"/>
+                <w:szCs w:val="24"/>
+              </w:rPr>
+              <w:t>2</w:t>
+            </w:r>
           </w:p>
         </w:tc>
       </w:tr>
@@ -21092,6 +21117,13 @@
                 <w:szCs w:val="24"/>
               </w:rPr>
             </w:pPr>
+            <w:r>
+              <w:rPr>
+                <w:sz w:val="24"/>
+                <w:szCs w:val="24"/>
+              </w:rPr>
+              <w:t>9</w:t>
+            </w:r>
           </w:p>
         </w:tc>
       </w:tr>
@@ -21133,6 +21165,13 @@
                 <w:szCs w:val="24"/>
               </w:rPr>
             </w:pPr>
+            <w:r>
+              <w:rPr>
+                <w:sz w:val="24"/>
+                <w:szCs w:val="24"/>
+              </w:rPr>
+              <w:t>11</w:t>
+            </w:r>
           </w:p>
         </w:tc>
       </w:tr>
@@ -21174,6 +21213,13 @@
                 <w:szCs w:val="24"/>
               </w:rPr>
             </w:pPr>
+            <w:r>
+              <w:rPr>
+                <w:sz w:val="24"/>
+                <w:szCs w:val="24"/>
+              </w:rPr>
+              <w:t>25</w:t>
+            </w:r>
           </w:p>
         </w:tc>
       </w:tr>
@@ -21215,6 +21261,13 @@
                 <w:szCs w:val="24"/>
               </w:rPr>
             </w:pPr>
+            <w:r>
+              <w:rPr>
+                <w:sz w:val="24"/>
+                <w:szCs w:val="24"/>
+              </w:rPr>
+              <w:t>70</w:t>
+            </w:r>
           </w:p>
         </w:tc>
       </w:tr>
@@ -21256,6 +21309,13 @@
                 <w:szCs w:val="24"/>
               </w:rPr>
             </w:pPr>
+            <w:r>
+              <w:rPr>
+                <w:sz w:val="24"/>
+                <w:szCs w:val="24"/>
+              </w:rPr>
+              <w:t>53</w:t>
+            </w:r>
           </w:p>
         </w:tc>
       </w:tr>
@@ -21297,6 +21357,13 @@
                 <w:szCs w:val="24"/>
               </w:rPr>
             </w:pPr>
+            <w:r>
+              <w:rPr>
+                <w:sz w:val="24"/>
+                <w:szCs w:val="24"/>
+              </w:rPr>
+              <w:t>84</w:t>
+            </w:r>
           </w:p>
         </w:tc>
       </w:tr>
@@ -21338,6 +21405,13 @@
                 <w:szCs w:val="24"/>
               </w:rPr>
             </w:pPr>
+            <w:r>
+              <w:rPr>
+                <w:sz w:val="24"/>
+                <w:szCs w:val="24"/>
+              </w:rPr>
+              <w:t>78</w:t>
+            </w:r>
           </w:p>
         </w:tc>
       </w:tr>
@@ -21379,6 +21453,13 @@
                 <w:szCs w:val="24"/>
               </w:rPr>
             </w:pPr>
+            <w:r>
+              <w:rPr>
+                <w:sz w:val="24"/>
+                <w:szCs w:val="24"/>
+              </w:rPr>
+              <w:t>202</w:t>
+            </w:r>
           </w:p>
         </w:tc>
       </w:tr>
@@ -21420,6 +21501,13 @@
                 <w:szCs w:val="24"/>
               </w:rPr>
             </w:pPr>
+            <w:r>
+              <w:rPr>
+                <w:sz w:val="24"/>
+                <w:szCs w:val="24"/>
+              </w:rPr>
+              <w:t>428</w:t>
+            </w:r>
           </w:p>
         </w:tc>
       </w:tr>
@@ -21461,6 +21549,13 @@
                 <w:szCs w:val="24"/>
               </w:rPr>
             </w:pPr>
+            <w:r>
+              <w:rPr>
+                <w:sz w:val="24"/>
+                <w:szCs w:val="24"/>
+              </w:rPr>
+              <w:t>940</w:t>
+            </w:r>
           </w:p>
         </w:tc>
       </w:tr>
@@ -21502,6 +21597,13 @@
                 <w:szCs w:val="24"/>
               </w:rPr>
             </w:pPr>
+            <w:r>
+              <w:rPr>
+                <w:sz w:val="24"/>
+                <w:szCs w:val="24"/>
+              </w:rPr>
+              <w:t>1875</w:t>
+            </w:r>
           </w:p>
         </w:tc>
       </w:tr>
@@ -21540,6 +21642,13 @@
                 <w:szCs w:val="24"/>
               </w:rPr>
             </w:pPr>
+            <w:r>
+              <w:rPr>
+                <w:sz w:val="24"/>
+                <w:szCs w:val="24"/>
+              </w:rPr>
+              <w:t>5260</w:t>
+            </w:r>
           </w:p>
         </w:tc>
       </w:tr>
@@ -21578,6 +21687,13 @@
                 <w:szCs w:val="24"/>
               </w:rPr>
             </w:pPr>
+            <w:r>
+              <w:rPr>
+                <w:sz w:val="24"/>
+                <w:szCs w:val="24"/>
+              </w:rPr>
+              <w:t>11027</w:t>
+            </w:r>
           </w:p>
         </w:tc>
       </w:tr>
@@ -21617,6 +21733,13 @@
                 <w:szCs w:val="24"/>
               </w:rPr>
             </w:pPr>
+            <w:r>
+              <w:rPr>
+                <w:sz w:val="24"/>
+                <w:szCs w:val="24"/>
+              </w:rPr>
+              <w:t>30102</w:t>
+            </w:r>
           </w:p>
         </w:tc>
       </w:tr>
@@ -21625,797 +21748,49 @@
       <w:pPr>
         <w:pStyle w:val="Textoindependiente"/>
         <w:rPr>
+          <w:sz w:val="2"/>
+          <w:szCs w:val="2"/>
+        </w:rPr>
+      </w:pPr>
+    </w:p>
+    <w:p>
+      <w:pPr>
+        <w:pStyle w:val="Textoindependiente"/>
+        <w:rPr>
+          <w:b/>
           <w:sz w:val="24"/>
           <w:szCs w:val="24"/>
         </w:rPr>
       </w:pPr>
-    </w:p>
-    <w:p>
-      <w:pPr>
-        <w:pStyle w:val="Textoindependiente"/>
-        <w:rPr>
-          <w:b/>
+      <w:r>
+        <w:rPr>
           <w:sz w:val="24"/>
           <w:szCs w:val="24"/>
         </w:rPr>
-      </w:pPr>
-      <w:r>
-        <w:rPr>
-          <w:b/>
+        <w:t>Con este algoritmo los tiempos escalan de una manera muy lineal al aumentar la n</w:t>
+      </w:r>
+      <w:r>
+        <w:rPr>
           <w:sz w:val="24"/>
           <w:szCs w:val="24"/>
         </w:rPr>
-        <w:t>Implementar el módulo coloreado_grafo.py, de modo que podamos calcular una solución y visualizarla con el módulo proporcionado en Python.</w:t>
-      </w:r>
-      <w:r>
-        <w:rPr>
-          <w:b/>
+        <w:t xml:space="preserve"> (si la duplicamos vemos que el tiempo se multiplica por 2)</w:t>
+      </w:r>
+      <w:r>
+        <w:rPr>
           <w:sz w:val="24"/>
           <w:szCs w:val="24"/>
         </w:rPr>
+        <w:t>.</w:t>
+      </w:r>
+      <w:r>
+        <w:rPr>
+          <w:b/>
+          <w:sz w:val="24"/>
+          <w:szCs w:val="24"/>
+        </w:rPr>
         <w:t xml:space="preserve"> </w:t>
       </w:r>
-      <w:r>
-        <w:rPr>
-          <w:b/>
-          <w:sz w:val="24"/>
-          <w:szCs w:val="24"/>
-        </w:rPr>
-        <w:t>Razone convenientemente la complejidad temporal del algoritmo im</w:t>
-      </w:r>
-      <w:r>
-        <w:rPr>
-          <w:b/>
-          <w:sz w:val="24"/>
-          <w:szCs w:val="24"/>
-        </w:rPr>
-        <w:t>plementado.</w:t>
-      </w:r>
-    </w:p>
-    <w:p>
-      <w:pPr>
-        <w:pStyle w:val="Textoindependiente"/>
-        <w:rPr>
-          <w:szCs w:val="24"/>
-        </w:rPr>
-      </w:pPr>
-    </w:p>
-    <w:p>
-      <w:pPr>
-        <w:pStyle w:val="Textoindependiente"/>
-        <w:rPr>
-          <w:b/>
-          <w:sz w:val="24"/>
-          <w:szCs w:val="24"/>
-        </w:rPr>
-      </w:pPr>
-      <w:r>
-        <w:rPr>
-          <w:b/>
-          <w:sz w:val="24"/>
-          <w:szCs w:val="24"/>
-        </w:rPr>
-        <w:t xml:space="preserve">Implementar un módulo devorador_tiempos.py, que emplee los grafos contenidos en </w:t>
-      </w:r>
-      <w:proofErr w:type="spellStart"/>
-      <w:r>
-        <w:rPr>
-          <w:b/>
-          <w:sz w:val="24"/>
-          <w:szCs w:val="24"/>
-        </w:rPr>
-        <w:t>sols</w:t>
-      </w:r>
-      <w:proofErr w:type="spellEnd"/>
-      <w:r>
-        <w:rPr>
-          <w:b/>
-          <w:sz w:val="24"/>
-          <w:szCs w:val="24"/>
-        </w:rPr>
-        <w:t xml:space="preserve"> y calculando el tiempo que tarda el algoritmo hecho en el apartado anterior en resolver el problema, de forma que se pueda ir rellenando la siguiente tabla.</w:t>
-      </w:r>
-    </w:p>
-    <w:p>
-      <w:pPr>
-        <w:pStyle w:val="Textoindependiente"/>
-        <w:rPr>
-          <w:b/>
-          <w:sz w:val="24"/>
-          <w:szCs w:val="24"/>
-        </w:rPr>
-      </w:pPr>
-      <w:r>
-        <w:rPr>
-          <w:b/>
-          <w:sz w:val="24"/>
-          <w:szCs w:val="24"/>
-        </w:rPr>
-        <w:t>Razone: ¿siguen la complejidad calculada los tiempos de la tabla?</w:t>
-      </w:r>
-    </w:p>
-    <w:tbl>
-      <w:tblPr>
-        <w:tblStyle w:val="Tablaconcuadrcula"/>
-        <w:tblW w:w="0" w:type="auto"/>
-        <w:tblInd w:w="2263" w:type="dxa"/>
-        <w:tblLook w:val="04A0" w:firstRow="1" w:lastRow="0" w:firstColumn="1" w:lastColumn="0" w:noHBand="0" w:noVBand="1"/>
-      </w:tblPr>
-      <w:tblGrid>
-        <w:gridCol w:w="1984"/>
-        <w:gridCol w:w="3119"/>
-      </w:tblGrid>
-      <w:tr>
-        <w:tc>
-          <w:tcPr>
-            <w:tcW w:w="1984" w:type="dxa"/>
-          </w:tcPr>
-          <w:p>
-            <w:pPr>
-              <w:pStyle w:val="Textoindependiente"/>
-              <w:jc w:val="center"/>
-              <w:rPr>
-                <w:b/>
-                <w:sz w:val="24"/>
-                <w:szCs w:val="24"/>
-              </w:rPr>
-            </w:pPr>
-            <w:r>
-              <w:rPr>
-                <w:b/>
-                <w:sz w:val="24"/>
-                <w:szCs w:val="24"/>
-              </w:rPr>
-              <w:t>n</w:t>
-            </w:r>
-          </w:p>
-        </w:tc>
-        <w:tc>
-          <w:tcPr>
-            <w:tcW w:w="3119" w:type="dxa"/>
-          </w:tcPr>
-          <w:p>
-            <w:pPr>
-              <w:pStyle w:val="Textoindependiente"/>
-              <w:jc w:val="center"/>
-              <w:rPr>
-                <w:b/>
-                <w:sz w:val="24"/>
-                <w:szCs w:val="24"/>
-              </w:rPr>
-            </w:pPr>
-            <w:r>
-              <w:rPr>
-                <w:b/>
-                <w:sz w:val="24"/>
-                <w:szCs w:val="24"/>
-              </w:rPr>
-              <w:t>t Coloreado (ms)</w:t>
-            </w:r>
-          </w:p>
-        </w:tc>
-      </w:tr>
-      <w:tr>
-        <w:tc>
-          <w:tcPr>
-            <w:tcW w:w="1984" w:type="dxa"/>
-          </w:tcPr>
-          <w:p>
-            <w:pPr>
-              <w:pStyle w:val="Textoindependiente"/>
-              <w:jc w:val="center"/>
-              <w:rPr>
-                <w:i/>
-                <w:sz w:val="24"/>
-                <w:szCs w:val="24"/>
-              </w:rPr>
-            </w:pPr>
-            <w:r>
-              <w:rPr>
-                <w:i/>
-                <w:sz w:val="24"/>
-                <w:szCs w:val="24"/>
-              </w:rPr>
-              <w:t>4</w:t>
-            </w:r>
-          </w:p>
-        </w:tc>
-        <w:tc>
-          <w:tcPr>
-            <w:tcW w:w="3119" w:type="dxa"/>
-          </w:tcPr>
-          <w:p>
-            <w:pPr>
-              <w:pStyle w:val="Textoindependiente"/>
-              <w:jc w:val="center"/>
-              <w:rPr>
-                <w:sz w:val="24"/>
-                <w:szCs w:val="24"/>
-              </w:rPr>
-            </w:pPr>
-          </w:p>
-        </w:tc>
-      </w:tr>
-      <w:tr>
-        <w:tc>
-          <w:tcPr>
-            <w:tcW w:w="1984" w:type="dxa"/>
-          </w:tcPr>
-          <w:p>
-            <w:pPr>
-              <w:pStyle w:val="Textoindependiente"/>
-              <w:jc w:val="center"/>
-              <w:rPr>
-                <w:i/>
-                <w:sz w:val="24"/>
-                <w:szCs w:val="24"/>
-              </w:rPr>
-            </w:pPr>
-            <w:r>
-              <w:rPr>
-                <w:i/>
-                <w:sz w:val="24"/>
-                <w:szCs w:val="24"/>
-              </w:rPr>
-              <w:t>8</w:t>
-            </w:r>
-          </w:p>
-        </w:tc>
-        <w:tc>
-          <w:tcPr>
-            <w:tcW w:w="3119" w:type="dxa"/>
-          </w:tcPr>
-          <w:p>
-            <w:pPr>
-              <w:pStyle w:val="Textoindependiente"/>
-              <w:jc w:val="center"/>
-              <w:rPr>
-                <w:sz w:val="24"/>
-                <w:szCs w:val="24"/>
-              </w:rPr>
-            </w:pPr>
-          </w:p>
-        </w:tc>
-      </w:tr>
-      <w:tr>
-        <w:tc>
-          <w:tcPr>
-            <w:tcW w:w="1984" w:type="dxa"/>
-          </w:tcPr>
-          <w:p>
-            <w:pPr>
-              <w:pStyle w:val="Textoindependiente"/>
-              <w:jc w:val="center"/>
-              <w:rPr>
-                <w:i/>
-                <w:sz w:val="24"/>
-                <w:szCs w:val="24"/>
-              </w:rPr>
-            </w:pPr>
-            <w:r>
-              <w:rPr>
-                <w:i/>
-                <w:sz w:val="24"/>
-                <w:szCs w:val="24"/>
-              </w:rPr>
-              <w:t>16</w:t>
-            </w:r>
-          </w:p>
-        </w:tc>
-        <w:tc>
-          <w:tcPr>
-            <w:tcW w:w="3119" w:type="dxa"/>
-          </w:tcPr>
-          <w:p>
-            <w:pPr>
-              <w:pStyle w:val="Textoindependiente"/>
-              <w:jc w:val="center"/>
-              <w:rPr>
-                <w:sz w:val="24"/>
-                <w:szCs w:val="24"/>
-              </w:rPr>
-            </w:pPr>
-          </w:p>
-        </w:tc>
-      </w:tr>
-      <w:tr>
-        <w:tc>
-          <w:tcPr>
-            <w:tcW w:w="1984" w:type="dxa"/>
-          </w:tcPr>
-          <w:p>
-            <w:pPr>
-              <w:pStyle w:val="Textoindependiente"/>
-              <w:jc w:val="center"/>
-              <w:rPr>
-                <w:i/>
-                <w:sz w:val="24"/>
-                <w:szCs w:val="24"/>
-              </w:rPr>
-            </w:pPr>
-            <w:r>
-              <w:rPr>
-                <w:i/>
-                <w:sz w:val="24"/>
-                <w:szCs w:val="24"/>
-              </w:rPr>
-              <w:t>32</w:t>
-            </w:r>
-          </w:p>
-        </w:tc>
-        <w:tc>
-          <w:tcPr>
-            <w:tcW w:w="3119" w:type="dxa"/>
-          </w:tcPr>
-          <w:p>
-            <w:pPr>
-              <w:pStyle w:val="Textoindependiente"/>
-              <w:jc w:val="center"/>
-              <w:rPr>
-                <w:sz w:val="24"/>
-                <w:szCs w:val="24"/>
-              </w:rPr>
-            </w:pPr>
-          </w:p>
-        </w:tc>
-      </w:tr>
-      <w:tr>
-        <w:tc>
-          <w:tcPr>
-            <w:tcW w:w="1984" w:type="dxa"/>
-          </w:tcPr>
-          <w:p>
-            <w:pPr>
-              <w:pStyle w:val="Textoindependiente"/>
-              <w:jc w:val="center"/>
-              <w:rPr>
-                <w:i/>
-                <w:sz w:val="24"/>
-                <w:szCs w:val="24"/>
-              </w:rPr>
-            </w:pPr>
-            <w:r>
-              <w:rPr>
-                <w:i/>
-                <w:sz w:val="24"/>
-                <w:szCs w:val="24"/>
-              </w:rPr>
-              <w:t>64</w:t>
-            </w:r>
-          </w:p>
-        </w:tc>
-        <w:tc>
-          <w:tcPr>
-            <w:tcW w:w="3119" w:type="dxa"/>
-          </w:tcPr>
-          <w:p>
-            <w:pPr>
-              <w:pStyle w:val="Textoindependiente"/>
-              <w:jc w:val="center"/>
-              <w:rPr>
-                <w:sz w:val="24"/>
-                <w:szCs w:val="24"/>
-              </w:rPr>
-            </w:pPr>
-          </w:p>
-        </w:tc>
-      </w:tr>
-      <w:tr>
-        <w:tc>
-          <w:tcPr>
-            <w:tcW w:w="1984" w:type="dxa"/>
-          </w:tcPr>
-          <w:p>
-            <w:pPr>
-              <w:pStyle w:val="Textoindependiente"/>
-              <w:jc w:val="center"/>
-              <w:rPr>
-                <w:i/>
-                <w:sz w:val="24"/>
-                <w:szCs w:val="24"/>
-              </w:rPr>
-            </w:pPr>
-            <w:r>
-              <w:rPr>
-                <w:i/>
-                <w:sz w:val="24"/>
-                <w:szCs w:val="24"/>
-              </w:rPr>
-              <w:t>100</w:t>
-            </w:r>
-          </w:p>
-        </w:tc>
-        <w:tc>
-          <w:tcPr>
-            <w:tcW w:w="3119" w:type="dxa"/>
-          </w:tcPr>
-          <w:p>
-            <w:pPr>
-              <w:pStyle w:val="Textoindependiente"/>
-              <w:jc w:val="center"/>
-              <w:rPr>
-                <w:sz w:val="24"/>
-                <w:szCs w:val="24"/>
-              </w:rPr>
-            </w:pPr>
-          </w:p>
-        </w:tc>
-      </w:tr>
-      <w:tr>
-        <w:tc>
-          <w:tcPr>
-            <w:tcW w:w="1984" w:type="dxa"/>
-          </w:tcPr>
-          <w:p>
-            <w:pPr>
-              <w:pStyle w:val="Textoindependiente"/>
-              <w:jc w:val="center"/>
-              <w:rPr>
-                <w:i/>
-                <w:sz w:val="24"/>
-                <w:szCs w:val="24"/>
-              </w:rPr>
-            </w:pPr>
-            <w:r>
-              <w:rPr>
-                <w:i/>
-                <w:sz w:val="24"/>
-                <w:szCs w:val="24"/>
-              </w:rPr>
-              <w:t>128</w:t>
-            </w:r>
-          </w:p>
-        </w:tc>
-        <w:tc>
-          <w:tcPr>
-            <w:tcW w:w="3119" w:type="dxa"/>
-          </w:tcPr>
-          <w:p>
-            <w:pPr>
-              <w:pStyle w:val="Textoindependiente"/>
-              <w:jc w:val="center"/>
-              <w:rPr>
-                <w:sz w:val="24"/>
-                <w:szCs w:val="24"/>
-              </w:rPr>
-            </w:pPr>
-          </w:p>
-        </w:tc>
-      </w:tr>
-      <w:tr>
-        <w:tc>
-          <w:tcPr>
-            <w:tcW w:w="1984" w:type="dxa"/>
-          </w:tcPr>
-          <w:p>
-            <w:pPr>
-              <w:pStyle w:val="Textoindependiente"/>
-              <w:jc w:val="center"/>
-              <w:rPr>
-                <w:i/>
-                <w:sz w:val="24"/>
-                <w:szCs w:val="24"/>
-              </w:rPr>
-            </w:pPr>
-            <w:r>
-              <w:rPr>
-                <w:i/>
-                <w:sz w:val="24"/>
-                <w:szCs w:val="24"/>
-              </w:rPr>
-              <w:t>256</w:t>
-            </w:r>
-          </w:p>
-        </w:tc>
-        <w:tc>
-          <w:tcPr>
-            <w:tcW w:w="3119" w:type="dxa"/>
-          </w:tcPr>
-          <w:p>
-            <w:pPr>
-              <w:pStyle w:val="Textoindependiente"/>
-              <w:jc w:val="center"/>
-              <w:rPr>
-                <w:sz w:val="24"/>
-                <w:szCs w:val="24"/>
-              </w:rPr>
-            </w:pPr>
-          </w:p>
-        </w:tc>
-      </w:tr>
-      <w:tr>
-        <w:tc>
-          <w:tcPr>
-            <w:tcW w:w="1984" w:type="dxa"/>
-          </w:tcPr>
-          <w:p>
-            <w:pPr>
-              <w:pStyle w:val="Textoindependiente"/>
-              <w:jc w:val="center"/>
-              <w:rPr>
-                <w:i/>
-                <w:sz w:val="24"/>
-                <w:szCs w:val="24"/>
-              </w:rPr>
-            </w:pPr>
-            <w:r>
-              <w:rPr>
-                <w:i/>
-                <w:sz w:val="24"/>
-                <w:szCs w:val="24"/>
-              </w:rPr>
-              <w:t>512</w:t>
-            </w:r>
-          </w:p>
-        </w:tc>
-        <w:tc>
-          <w:tcPr>
-            <w:tcW w:w="3119" w:type="dxa"/>
-          </w:tcPr>
-          <w:p>
-            <w:pPr>
-              <w:pStyle w:val="Textoindependiente"/>
-              <w:jc w:val="center"/>
-              <w:rPr>
-                <w:sz w:val="24"/>
-                <w:szCs w:val="24"/>
-              </w:rPr>
-            </w:pPr>
-          </w:p>
-        </w:tc>
-      </w:tr>
-      <w:tr>
-        <w:tc>
-          <w:tcPr>
-            <w:tcW w:w="1984" w:type="dxa"/>
-          </w:tcPr>
-          <w:p>
-            <w:pPr>
-              <w:pStyle w:val="Textoindependiente"/>
-              <w:jc w:val="center"/>
-              <w:rPr>
-                <w:i/>
-                <w:sz w:val="24"/>
-                <w:szCs w:val="24"/>
-              </w:rPr>
-            </w:pPr>
-            <w:r>
-              <w:rPr>
-                <w:i/>
-                <w:sz w:val="24"/>
-                <w:szCs w:val="24"/>
-              </w:rPr>
-              <w:t>1024</w:t>
-            </w:r>
-          </w:p>
-        </w:tc>
-        <w:tc>
-          <w:tcPr>
-            <w:tcW w:w="3119" w:type="dxa"/>
-          </w:tcPr>
-          <w:p>
-            <w:pPr>
-              <w:pStyle w:val="Textoindependiente"/>
-              <w:jc w:val="center"/>
-              <w:rPr>
-                <w:sz w:val="24"/>
-                <w:szCs w:val="24"/>
-              </w:rPr>
-            </w:pPr>
-          </w:p>
-        </w:tc>
-      </w:tr>
-      <w:tr>
-        <w:tc>
-          <w:tcPr>
-            <w:tcW w:w="1984" w:type="dxa"/>
-          </w:tcPr>
-          <w:p>
-            <w:pPr>
-              <w:pStyle w:val="Textoindependiente"/>
-              <w:jc w:val="center"/>
-              <w:rPr>
-                <w:i/>
-                <w:sz w:val="24"/>
-                <w:szCs w:val="24"/>
-              </w:rPr>
-            </w:pPr>
-            <w:r>
-              <w:rPr>
-                <w:i/>
-                <w:sz w:val="24"/>
-                <w:szCs w:val="24"/>
-              </w:rPr>
-              <w:t>2048</w:t>
-            </w:r>
-          </w:p>
-        </w:tc>
-        <w:tc>
-          <w:tcPr>
-            <w:tcW w:w="3119" w:type="dxa"/>
-          </w:tcPr>
-          <w:p>
-            <w:pPr>
-              <w:pStyle w:val="Textoindependiente"/>
-              <w:jc w:val="center"/>
-              <w:rPr>
-                <w:sz w:val="24"/>
-                <w:szCs w:val="24"/>
-              </w:rPr>
-            </w:pPr>
-          </w:p>
-        </w:tc>
-      </w:tr>
-      <w:tr>
-        <w:tc>
-          <w:tcPr>
-            <w:tcW w:w="1984" w:type="dxa"/>
-          </w:tcPr>
-          <w:p>
-            <w:pPr>
-              <w:pStyle w:val="Textoindependiente"/>
-              <w:jc w:val="center"/>
-              <w:rPr>
-                <w:i/>
-                <w:sz w:val="24"/>
-                <w:szCs w:val="24"/>
-              </w:rPr>
-            </w:pPr>
-            <w:r>
-              <w:rPr>
-                <w:i/>
-                <w:sz w:val="24"/>
-                <w:szCs w:val="24"/>
-              </w:rPr>
-              <w:t>4096</w:t>
-            </w:r>
-          </w:p>
-        </w:tc>
-        <w:tc>
-          <w:tcPr>
-            <w:tcW w:w="3119" w:type="dxa"/>
-          </w:tcPr>
-          <w:p>
-            <w:pPr>
-              <w:pStyle w:val="Textoindependiente"/>
-              <w:jc w:val="center"/>
-              <w:rPr>
-                <w:sz w:val="24"/>
-                <w:szCs w:val="24"/>
-              </w:rPr>
-            </w:pPr>
-          </w:p>
-        </w:tc>
-      </w:tr>
-      <w:tr>
-        <w:tc>
-          <w:tcPr>
-            <w:tcW w:w="1984" w:type="dxa"/>
-          </w:tcPr>
-          <w:p>
-            <w:pPr>
-              <w:pStyle w:val="Textoindependiente"/>
-              <w:jc w:val="center"/>
-              <w:rPr>
-                <w:i/>
-                <w:sz w:val="24"/>
-                <w:szCs w:val="24"/>
-              </w:rPr>
-            </w:pPr>
-            <w:r>
-              <w:rPr>
-                <w:i/>
-                <w:sz w:val="24"/>
-                <w:szCs w:val="24"/>
-              </w:rPr>
-              <w:t>8192</w:t>
-            </w:r>
-          </w:p>
-        </w:tc>
-        <w:tc>
-          <w:tcPr>
-            <w:tcW w:w="3119" w:type="dxa"/>
-          </w:tcPr>
-          <w:p>
-            <w:pPr>
-              <w:pStyle w:val="Textoindependiente"/>
-              <w:jc w:val="center"/>
-              <w:rPr>
-                <w:sz w:val="24"/>
-                <w:szCs w:val="24"/>
-              </w:rPr>
-            </w:pPr>
-          </w:p>
-        </w:tc>
-      </w:tr>
-      <w:tr>
-        <w:tc>
-          <w:tcPr>
-            <w:tcW w:w="1984" w:type="dxa"/>
-          </w:tcPr>
-          <w:p>
-            <w:pPr>
-              <w:jc w:val="center"/>
-              <w:rPr>
-                <w:i/>
-                <w:sz w:val="24"/>
-              </w:rPr>
-            </w:pPr>
-            <w:r>
-              <w:rPr>
-                <w:i/>
-                <w:sz w:val="24"/>
-              </w:rPr>
-              <w:t>16384</w:t>
-            </w:r>
-          </w:p>
-        </w:tc>
-        <w:tc>
-          <w:tcPr>
-            <w:tcW w:w="3119" w:type="dxa"/>
-          </w:tcPr>
-          <w:p>
-            <w:pPr>
-              <w:pStyle w:val="Textoindependiente"/>
-              <w:jc w:val="center"/>
-              <w:rPr>
-                <w:sz w:val="24"/>
-                <w:szCs w:val="24"/>
-              </w:rPr>
-            </w:pPr>
-          </w:p>
-        </w:tc>
-      </w:tr>
-      <w:tr>
-        <w:tc>
-          <w:tcPr>
-            <w:tcW w:w="1984" w:type="dxa"/>
-          </w:tcPr>
-          <w:p>
-            <w:pPr>
-              <w:jc w:val="center"/>
-              <w:rPr>
-                <w:i/>
-                <w:sz w:val="24"/>
-              </w:rPr>
-            </w:pPr>
-            <w:r>
-              <w:rPr>
-                <w:i/>
-                <w:sz w:val="24"/>
-              </w:rPr>
-              <w:t>32768</w:t>
-            </w:r>
-          </w:p>
-        </w:tc>
-        <w:tc>
-          <w:tcPr>
-            <w:tcW w:w="3119" w:type="dxa"/>
-          </w:tcPr>
-          <w:p>
-            <w:pPr>
-              <w:pStyle w:val="Textoindependiente"/>
-              <w:jc w:val="center"/>
-              <w:rPr>
-                <w:sz w:val="24"/>
-                <w:szCs w:val="24"/>
-              </w:rPr>
-            </w:pPr>
-          </w:p>
-        </w:tc>
-      </w:tr>
-    </w:tbl>
-    <w:p>
-      <w:pPr>
-        <w:pStyle w:val="Textoindependiente"/>
-        <w:rPr>
-          <w:b/>
-          <w:sz w:val="24"/>
-          <w:szCs w:val="24"/>
-        </w:rPr>
-      </w:pPr>
-      <w:bookmarkStart w:id="0" w:name="_GoBack"/>
-      <w:bookmarkEnd w:id="0"/>
     </w:p>
     <w:sectPr>
       <w:pgSz w:w="11906" w:h="16838"/>
@@ -23325,7 +22700,7 @@
 </file>
 
 <file path=customXml/itemProps1.xml><?xml version="1.0" encoding="utf-8"?>
-<ds:datastoreItem xmlns:ds="http://schemas.openxmlformats.org/officeDocument/2006/customXml" ds:itemID="{3B472B19-D520-4D18-A2FD-F6C549D8CB2A}">
+<ds:datastoreItem xmlns:ds="http://schemas.openxmlformats.org/officeDocument/2006/customXml" ds:itemID="{20822AAD-1E7F-4FBF-9B9F-EFA4B2A104B9}">
   <ds:schemaRefs>
     <ds:schemaRef ds:uri="http://schemas.openxmlformats.org/officeDocument/2006/bibliography"/>
   </ds:schemaRefs>

</xml_diff>